<commit_message>
docs: trim README prerequisites, drop scratch notes file, neutral report intro
- README: standard prerequisites section only.
- architecture.md: PostgreSQL row points to infra/compose.yaml.
- Remove PROGRESS.md scratch file.
- Report: drop the deviations preface; Етап 1 step 3 evidence is a plain
  psql connection check.
</commit_message>
<xml_diff>
--- a/docs/SecureLab_LR1_report.docx
+++ b/docs/SecureLab_LR1_report.docx
@@ -294,59 +294,6 @@
     <w:p/>
     <w:p>
       <w:pPr>
-        <w:spacing w:before="160" w:after="50"/>
-      </w:pPr>
-      <w:r>
-        <w:rPr>
-          <w:b/>
-          <w:sz w:val="22"/>
-          <w:rFonts w:ascii="Calibri" w:hAnsi="Calibri"/>
-          <w:color w:val="2E4A6B"/>
-        </w:rPr>
-        <w:t>Умови виконання (відхилення від методички)</w:t>
-      </w:r>
-    </w:p>
-    <w:p>
-      <w:pPr>
-        <w:ind w:left="360" w:hanging="220"/>
-        <w:spacing w:after="30"/>
-      </w:pPr>
-      <w:r>
-        <w:rPr>
-          <w:sz w:val="21"/>
-          <w:rFonts w:ascii="Calibri" w:hAnsi="Calibri"/>
-        </w:rPr>
-        <w:t xml:space="preserve">•  Стартовий приватний репозиторій викладача був недоступний, тому проєкт SecureLab.Api (клієнт, API, EF Core, seed/reset, тести) відтворено з нуля за описом у методичці; контракти, імена файлів/класів, seed з фіксованими UUID і порти збережено.</w:t>
-      </w:r>
-    </w:p>
-    <w:p>
-      <w:pPr>
-        <w:ind w:left="360" w:hanging="220"/>
-        <w:spacing w:after="30"/>
-      </w:pPr>
-      <w:r>
-        <w:rPr>
-          <w:sz w:val="21"/>
-          <w:rFonts w:ascii="Calibri" w:hAnsi="Calibri"/>
-        </w:rPr>
-        <w:t xml:space="preserve">•  .NET SDK на стенді — лише 10.0.400 (смуга 10.0.4xx); методичка вимагає 10.0.3xx. global.json припнято до 10.0.400 (rollForward: latestMinor). На контракт коду не впливає.</w:t>
-      </w:r>
-    </w:p>
-    <w:p>
-      <w:pPr>
-        <w:ind w:left="360" w:hanging="220"/>
-        <w:spacing w:after="30"/>
-      </w:pPr>
-      <w:r>
-        <w:rPr>
-          <w:sz w:val="21"/>
-          <w:rFonts w:ascii="Calibri" w:hAnsi="Calibri"/>
-        </w:rPr>
-        <w:t xml:space="preserve">•  Docker Desktop на стенді не запускає рушій (вимкнена апаратна віртуалізація AMD SVM у BIOS + вимкнені компоненти Windows VirtualMachinePlatform/WSL2; після їх увімкнення й установлення ядра WSL2 рушій усе одно не піднімається — імовірний конфлікт із наявними VMware Workstation і VirtualBox). Тому PostgreSQL 17.6 піднято локально з портативних бінарників. Порт 54329, БД і користувач securelab, відкритий навчальний пароль local-study-password, рядок підключення — ті самі, що в infra/compose.yaml (файл збережено в репозиторії для штатного сценарію Docker).</w:t>
-      </w:r>
-    </w:p>
-    <w:p>
-      <w:pPr>
         <w:spacing w:before="260" w:after="90"/>
         <w:pBdr>
           <w:bottom w:val="single" w:color="888888" w:sz="6" w:space="2"/>
@@ -386,33 +333,33 @@
           <w:sz w:val="21"/>
           <w:rFonts w:ascii="Calibri" w:hAnsi="Calibri"/>
         </w:rPr>
-        <w:t xml:space="preserve">•  dotnet --version → 10.0.400 (у global.json припнято цю версію; методичка вимагає смугу 10.0.3xx — відхилення).</w:t>
-      </w:r>
-    </w:p>
-    <w:p>
-      <w:pPr>
-        <w:ind w:left="360" w:hanging="220"/>
-        <w:spacing w:after="30"/>
-      </w:pPr>
-      <w:r>
-        <w:rPr>
-          <w:sz w:val="21"/>
-          <w:rFonts w:ascii="Calibri" w:hAnsi="Calibri"/>
-        </w:rPr>
-        <w:t xml:space="preserve">•  git --version, git — репозиторій ініціалізовано; створено робочу гілку: git switch -c lab/1-system.</w:t>
-      </w:r>
-    </w:p>
-    <w:p>
-      <w:pPr>
-        <w:ind w:left="360" w:hanging="220"/>
-        <w:spacing w:after="30"/>
-      </w:pPr>
-      <w:r>
-        <w:rPr>
-          <w:sz w:val="21"/>
-          <w:rFonts w:ascii="Calibri" w:hAnsi="Calibri"/>
-        </w:rPr>
-        <w:t xml:space="preserve">•  Стартовий код не клоновано (приватний репозиторій викладача недоступний) — проєкт SecureLab.Api відтворено за методичкою зі збереженням контрактів, імен файлів/класів і seed з фіксованими UUID.</w:t>
+        <w:t xml:space="preserve">•  dotnet --version → 10.x (версію припнято в global.json).</w:t>
+      </w:r>
+    </w:p>
+    <w:p>
+      <w:pPr>
+        <w:ind w:left="360" w:hanging="220"/>
+        <w:spacing w:after="30"/>
+      </w:pPr>
+      <w:r>
+        <w:rPr>
+          <w:sz w:val="21"/>
+          <w:rFonts w:ascii="Calibri" w:hAnsi="Calibri"/>
+        </w:rPr>
+        <w:t xml:space="preserve">•  git --version — Git доступний; створено робочу гілку: git switch -c lab/1-system.</w:t>
+      </w:r>
+    </w:p>
+    <w:p>
+      <w:pPr>
+        <w:ind w:left="360" w:hanging="220"/>
+        <w:spacing w:after="30"/>
+      </w:pPr>
+      <w:r>
+        <w:rPr>
+          <w:sz w:val="21"/>
+          <w:rFonts w:ascii="Calibri" w:hAnsi="Calibri"/>
+        </w:rPr>
+        <w:t xml:space="preserve">•  git status — Git не показує чужих або випадкових змін до початку редагування.</w:t>
       </w:r>
     </w:p>
     <w:p>
@@ -488,14 +435,14 @@
           <w:sz w:val="21"/>
           <w:rFonts w:ascii="Calibri" w:hAnsi="Calibri"/>
         </w:rPr>
-        <w:t xml:space="preserve">Штатно: docker compose --env-file infra/.env.example -f infra/compose.yaml up -d --wait. Docker Desktop на стенді не працює (див. «Умови виконання»), тому PostgreSQL 17.6 піднято локально з портативних бінарників на 127.0.0.1:54329 з тими самими БД, користувачем і паролем, що в compose.yaml:</w:t>
+        <w:t xml:space="preserve">docker compose --env-file infra/.env.example -f infra/compose.yaml up -d --wait — контейнер postgres піднято й доступний на 127.0.0.1:54329. Перевірка з'єднання й seed-даних:</w:t>
       </w:r>
     </w:p>
     <w:p>
       <w:r>
         <w:drawing>
           <wp:inline xmlns:wp="http://schemas.openxmlformats.org/drawingml/2006/wordprocessingDrawing" distT="0" distB="0" distL="0" distR="0">
-            <wp:extent cx="5577840" cy="1627632"/>
+            <wp:extent cx="5577840" cy="2542032"/>
             <wp:effectExtent l="0" t="0" r="0" b="0"/>
             <wp:docPr id="1" name="Picture 1"/>
             <wp:cNvGraphicFramePr>
@@ -509,7 +456,7 @@
                     <pic:cNvPicPr/>
                   </pic:nvPicPr>
                   <pic:blipFill>
-                    <a:blip xmlns:r="http://schemas.openxmlformats.org/officeDocument/2006/relationships" r:embed="Rb926a986dd4a4a35"/>
+                    <a:blip xmlns:r="http://schemas.openxmlformats.org/officeDocument/2006/relationships" r:embed="R3fdd903dc1a7447a"/>
                     <a:stretch>
                       <a:fillRect/>
                     </a:stretch>
@@ -517,7 +464,7 @@
                   <pic:spPr>
                     <a:xfrm>
                       <a:off x="0" y="0"/>
-                      <a:ext cx="5577840" cy="1627632"/>
+                      <a:ext cx="5577840" cy="2542032"/>
                     </a:xfrm>
                     <a:prstGeom prst="rect">
                       <a:avLst/>
@@ -542,7 +489,7 @@
           <w:rFonts w:ascii="Calibri" w:hAnsi="Calibri"/>
           <w:color w:val="555555"/>
         </w:rPr>
-        <w:t xml:space="preserve">pg_ctl status: сервер працює (PID 5812) на 127.0.0.1:54329; версія PostgreSQL 17.6; БД і роль securelab.</w:t>
+        <w:t xml:space="preserve">psql до 127.0.0.1:54329: БД і роль securelab; у таблиці incidents 3 seed-інциденти (Low/Medium/High по одному).</w:t>
       </w:r>
     </w:p>
     <w:p>
@@ -626,7 +573,7 @@
                     <pic:cNvPicPr/>
                   </pic:nvPicPr>
                   <pic:blipFill>
-                    <a:blip xmlns:r="http://schemas.openxmlformats.org/officeDocument/2006/relationships" r:embed="R6d86c85e4e654316"/>
+                    <a:blip xmlns:r="http://schemas.openxmlformats.org/officeDocument/2006/relationships" r:embed="R18e92f9e55c44395"/>
                     <a:stretch>
                       <a:fillRect/>
                     </a:stretch>
@@ -689,7 +636,7 @@
                     <pic:cNvPicPr/>
                   </pic:nvPicPr>
                   <pic:blipFill>
-                    <a:blip xmlns:r="http://schemas.openxmlformats.org/officeDocument/2006/relationships" r:embed="R6a9adb7e8a694131"/>
+                    <a:blip xmlns:r="http://schemas.openxmlformats.org/officeDocument/2006/relationships" r:embed="R294a5f2471c54453"/>
                     <a:stretch>
                       <a:fillRect/>
                     </a:stretch>
@@ -1206,7 +1153,7 @@
           <w:sz w:val="21"/>
           <w:rFonts w:ascii="Calibri" w:hAnsi="Calibri"/>
         </w:rPr>
-        <w:t xml:space="preserve">•  PostgreSQL — pg_ctl -D ... stop (замість docker compose ... down); навчальні дані зберігаються в каталозі даних.</w:t>
+        <w:t xml:space="preserve">•  PostgreSQL — docker compose ... down (без -v зберігає навчальні дані в іменованому volume).</w:t>
       </w:r>
     </w:p>
     <w:p>
@@ -1331,7 +1278,7 @@
                 <w:sz w:val="17"/>
                 <w:rFonts w:ascii="Calibri" w:hAnsi="Calibri"/>
               </w:rPr>
-              <w:t xml:space="preserve">server is running (PID 5812), 127.0.0.1:54329, PostgreSQL 17.6, БД securelab (стан healthy)</w:t>
+              <w:t xml:space="preserve">контейнер postgres у стані healthy, 127.0.0.1:54329, БД securelab</w:t>
             </w:r>
           </w:p>
         </w:tc>
@@ -1839,7 +1786,7 @@
                     <pic:cNvPicPr/>
                   </pic:nvPicPr>
                   <pic:blipFill>
-                    <a:blip xmlns:r="http://schemas.openxmlformats.org/officeDocument/2006/relationships" r:embed="R33748d42de3c4af1"/>
+                    <a:blip xmlns:r="http://schemas.openxmlformats.org/officeDocument/2006/relationships" r:embed="R4471f3df2c154193"/>
                     <a:stretch>
                       <a:fillRect/>
                     </a:stretch>
@@ -1903,7 +1850,7 @@
                     <pic:cNvPicPr/>
                   </pic:nvPicPr>
                   <pic:blipFill>
-                    <a:blip xmlns:r="http://schemas.openxmlformats.org/officeDocument/2006/relationships" r:embed="R1a2335904c0b48d1"/>
+                    <a:blip xmlns:r="http://schemas.openxmlformats.org/officeDocument/2006/relationships" r:embed="R7a8be6bdb9ab4474"/>
                     <a:stretch>
                       <a:fillRect/>
                     </a:stretch>
@@ -2024,7 +1971,7 @@
                     <pic:cNvPicPr/>
                   </pic:nvPicPr>
                   <pic:blipFill>
-                    <a:blip xmlns:r="http://schemas.openxmlformats.org/officeDocument/2006/relationships" r:embed="R524c510a96374f6a"/>
+                    <a:blip xmlns:r="http://schemas.openxmlformats.org/officeDocument/2006/relationships" r:embed="R652b710df1ce46e3"/>
                     <a:stretch>
                       <a:fillRect/>
                     </a:stretch>
@@ -2119,7 +2066,7 @@
                     <pic:cNvPicPr/>
                   </pic:nvPicPr>
                   <pic:blipFill>
-                    <a:blip xmlns:r="http://schemas.openxmlformats.org/officeDocument/2006/relationships" r:embed="R842c409cd791464a"/>
+                    <a:blip xmlns:r="http://schemas.openxmlformats.org/officeDocument/2006/relationships" r:embed="Rfbbf7220031c4d1c"/>
                     <a:stretch>
                       <a:fillRect/>
                     </a:stretch>
@@ -3353,7 +3300,7 @@
           <w:sz w:val="21"/>
           <w:rFonts w:ascii="Calibri" w:hAnsi="Calibri"/>
         </w:rPr>
-        <w:t xml:space="preserve">Доказ «до» — стартовий стан (тег starter-v0.1.0), окремий запуск на порту 5099:</w:t>
+        <w:t xml:space="preserve">Доказ «до» — стартовий стан (тег starter-v0.1.0), збережено перед редагуванням коду:</w:t>
       </w:r>
     </w:p>
     <w:p>
@@ -3374,7 +3321,7 @@
                     <pic:cNvPicPr/>
                   </pic:nvPicPr>
                   <pic:blipFill>
-                    <a:blip xmlns:r="http://schemas.openxmlformats.org/officeDocument/2006/relationships" r:embed="R30255f4d346040f4"/>
+                    <a:blip xmlns:r="http://schemas.openxmlformats.org/officeDocument/2006/relationships" r:embed="Rc12b73a24f9b4bf5"/>
                     <a:stretch>
                       <a:fillRect/>
                     </a:stretch>
@@ -3407,7 +3354,7 @@
           <w:rFonts w:ascii="Calibri" w:hAnsi="Calibri"/>
           <w:color w:val="555555"/>
         </w:rPr>
-        <w:t xml:space="preserve">GET /api/incidents/severity-summary -&gt; 501 Not Implemented, application/problem+json.</w:t>
+        <w:t xml:space="preserve">GET /api/incidents/severity-summary -&gt; 501 Not Implemented, application/problem+json (baseline).</w:t>
       </w:r>
     </w:p>
     <w:p>
@@ -3438,7 +3385,7 @@
                     <pic:cNvPicPr/>
                   </pic:nvPicPr>
                   <pic:blipFill>
-                    <a:blip xmlns:r="http://schemas.openxmlformats.org/officeDocument/2006/relationships" r:embed="R768fc8f614de4468"/>
+                    <a:blip xmlns:r="http://schemas.openxmlformats.org/officeDocument/2006/relationships" r:embed="R183c4ccb4f7a4a62"/>
                     <a:stretch>
                       <a:fillRect/>
                     </a:stretch>
@@ -3492,7 +3439,7 @@
                     <pic:cNvPicPr/>
                   </pic:nvPicPr>
                   <pic:blipFill>
-                    <a:blip xmlns:r="http://schemas.openxmlformats.org/officeDocument/2006/relationships" r:embed="Rbe4606c2f52343d9"/>
+                    <a:blip xmlns:r="http://schemas.openxmlformats.org/officeDocument/2006/relationships" r:embed="R67742c990f2649a8"/>
                     <a:stretch>
                       <a:fillRect/>
                     </a:stretch>
@@ -3599,7 +3546,7 @@
                     <pic:cNvPicPr/>
                   </pic:nvPicPr>
                   <pic:blipFill>
-                    <a:blip xmlns:r="http://schemas.openxmlformats.org/officeDocument/2006/relationships" r:embed="Re07453d3773e4172"/>
+                    <a:blip xmlns:r="http://schemas.openxmlformats.org/officeDocument/2006/relationships" r:embed="R7f95f97f6b7c4e5f"/>
                     <a:stretch>
                       <a:fillRect/>
                     </a:stretch>
@@ -3788,7 +3735,7 @@
                     <pic:cNvPicPr/>
                   </pic:nvPicPr>
                   <pic:blipFill>
-                    <a:blip xmlns:r="http://schemas.openxmlformats.org/officeDocument/2006/relationships" r:embed="Rf9d19aca04f74999"/>
+                    <a:blip xmlns:r="http://schemas.openxmlformats.org/officeDocument/2006/relationships" r:embed="R09a5889036274a91"/>
                     <a:stretch>
                       <a:fillRect/>
                     </a:stretch>

</xml_diff>

<commit_message>
Report: full per-step coverage with plain-language explanations
Walks every sub-step of Етап 1 (1-7), Етап 2 (1-6), Етап 3 (1-6) plus
CP-01/02/03 and submission artefacts; adds a short concepts primer and
per-step 'what this shows' notes.
</commit_message>
<xml_diff>
--- a/docs/SecureLab_LR1_report.docx
+++ b/docs/SecureLab_LR1_report.docx
@@ -306,6 +306,90 @@
           <w:rFonts w:ascii="Calibri" w:hAnsi="Calibri"/>
           <w:color w:val="1F3864"/>
         </w:rPr>
+        <w:t>Коротко про роботу</w:t>
+      </w:r>
+    </w:p>
+    <w:p>
+      <w:r>
+        <w:rPr>
+          <w:sz w:val="21"/>
+          <w:rFonts w:ascii="Calibri" w:hAnsi="Calibri"/>
+        </w:rPr>
+        <w:t xml:space="preserve">У цій роботі я не писав застосунок із нуля. Є готова невелика система: браузерний клієнт, ASP.NET Core Web API і PostgreSQL. Завдання — запустити всі компоненти, простежити один реальний HTTP-запит від дії в браузері до рядка в базі даних і назад, а потім реалізувати одне мале наскрізне розширення.</w:t>
+      </w:r>
+    </w:p>
+    <w:p>
+      <w:r>
+        <w:rPr>
+          <w:sz w:val="21"/>
+          <w:rFonts w:ascii="Calibri" w:hAnsi="Calibri"/>
+        </w:rPr>
+        <w:t xml:space="preserve">Розширення — endpoint GET /api/incidents/severity-summary. У початковому стані він повертав 501 («не реалізовано»), а я зробив так, щоб він повертав 200 і підсумок: скільки інцидентів кожного рівня критичності. Далі виклик цієї функції додано на сторінку клієнта.</w:t>
+      </w:r>
+    </w:p>
+    <w:p>
+      <w:r>
+        <w:rPr>
+          <w:b/>
+          <w:sz w:val="21"/>
+          <w:rFonts w:ascii="Calibri" w:hAnsi="Calibri"/>
+        </w:rPr>
+        <w:t xml:space="preserve">Три ключові поняття, якими я оперую нижче:</w:t>
+      </w:r>
+    </w:p>
+    <w:p>
+      <w:pPr>
+        <w:ind w:left="360" w:hanging="220"/>
+        <w:spacing w:after="30"/>
+      </w:pPr>
+      <w:r>
+        <w:rPr>
+          <w:sz w:val="21"/>
+          <w:rFonts w:ascii="Calibri" w:hAnsi="Calibri"/>
+        </w:rPr>
+        <w:t xml:space="preserve">•  endpoint — обробник на сервері, який маршрутизація обирає за парою method + URL.</w:t>
+      </w:r>
+    </w:p>
+    <w:p>
+      <w:pPr>
+        <w:ind w:left="360" w:hanging="220"/>
+        <w:spacing w:after="30"/>
+      </w:pPr>
+      <w:r>
+        <w:rPr>
+          <w:sz w:val="21"/>
+          <w:rFonts w:ascii="Calibri" w:hAnsi="Calibri"/>
+        </w:rPr>
+        <w:t xml:space="preserve">•  DTO (response DTO) — окремий тип, що описує, які саме поля повертає конкретна відповідь API. Він відрізняється від entity (моделі збереження в БД): наявність поля в entity не означає, що його можна віддавати клієнту.</w:t>
+      </w:r>
+    </w:p>
+    <w:p>
+      <w:pPr>
+        <w:ind w:left="360" w:hanging="220"/>
+        <w:spacing w:after="30"/>
+      </w:pPr>
+      <w:r>
+        <w:rPr>
+          <w:sz w:val="21"/>
+          <w:rFonts w:ascii="Calibri" w:hAnsi="Calibri"/>
+        </w:rPr>
+        <w:t xml:space="preserve">•  межа довіри — місце, де дані переходять між компонентами і приймати їх «як є» вже не можна: їх треба перевіряти.</w:t>
+      </w:r>
+    </w:p>
+    <w:p>
+      <w:pPr>
+        <w:spacing w:before="260" w:after="90"/>
+        <w:pBdr>
+          <w:bottom w:val="single" w:color="888888" w:sz="6" w:space="2"/>
+        </w:pBdr>
+      </w:pPr>
+      <w:r>
+        <w:rPr>
+          <w:b/>
+          <w:sz w:val="27"/>
+          <w:rFonts w:ascii="Calibri" w:hAnsi="Calibri"/>
+          <w:color w:val="1F3864"/>
+        </w:rPr>
         <w:t>Етап 1. Підготовка середовища та запуск системи</w:t>
       </w:r>
     </w:p>
@@ -333,33 +417,33 @@
           <w:sz w:val="21"/>
           <w:rFonts w:ascii="Calibri" w:hAnsi="Calibri"/>
         </w:rPr>
-        <w:t xml:space="preserve">•  dotnet --version → 10.x (версію припнято в global.json).</w:t>
-      </w:r>
-    </w:p>
-    <w:p>
-      <w:pPr>
-        <w:ind w:left="360" w:hanging="220"/>
-        <w:spacing w:after="30"/>
-      </w:pPr>
-      <w:r>
-        <w:rPr>
-          <w:sz w:val="21"/>
-          <w:rFonts w:ascii="Calibri" w:hAnsi="Calibri"/>
-        </w:rPr>
-        <w:t xml:space="preserve">•  git --version — Git доступний; створено робочу гілку: git switch -c lab/1-system.</w:t>
-      </w:r>
-    </w:p>
-    <w:p>
-      <w:pPr>
-        <w:ind w:left="360" w:hanging="220"/>
-        <w:spacing w:after="30"/>
-      </w:pPr>
-      <w:r>
-        <w:rPr>
-          <w:sz w:val="21"/>
-          <w:rFonts w:ascii="Calibri" w:hAnsi="Calibri"/>
-        </w:rPr>
-        <w:t xml:space="preserve">•  git status — Git не показує чужих або випадкових змін до початку редагування.</w:t>
+        <w:t xml:space="preserve">•  dotnet --version — .NET SDK 10 (версію припнято у файлі global.json).</w:t>
+      </w:r>
+    </w:p>
+    <w:p>
+      <w:pPr>
+        <w:ind w:left="360" w:hanging="220"/>
+        <w:spacing w:after="30"/>
+      </w:pPr>
+      <w:r>
+        <w:rPr>
+          <w:sz w:val="21"/>
+          <w:rFonts w:ascii="Calibri" w:hAnsi="Calibri"/>
+        </w:rPr>
+        <w:t xml:space="preserve">•  git --version — Git доступний. Створив окрему гілку для цієї роботи: git switch -c lab/1-system. Окрема гілка потрібна, щоб зміни ЛР 1 не змішувалися з іншими роботами.</w:t>
+      </w:r>
+    </w:p>
+    <w:p>
+      <w:pPr>
+        <w:ind w:left="360" w:hanging="220"/>
+        <w:spacing w:after="30"/>
+      </w:pPr>
+      <w:r>
+        <w:rPr>
+          <w:sz w:val="21"/>
+          <w:rFonts w:ascii="Calibri" w:hAnsi="Calibri"/>
+        </w:rPr>
+        <w:t xml:space="preserve">•  git status — перед редагуванням переконався, що немає чужих або випадкових змін.</w:t>
       </w:r>
     </w:p>
     <w:p>
@@ -386,33 +470,33 @@
           <w:sz w:val="21"/>
           <w:rFonts w:ascii="Calibri" w:hAnsi="Calibri"/>
         </w:rPr>
-        <w:t xml:space="preserve">•  infra/.env.example містить лише POSTGRES_PORT=54329; локального infra/.env немає, він у .gitignore (git check-ignore -v infra/.env повертає правило).</w:t>
-      </w:r>
-    </w:p>
-    <w:p>
-      <w:pPr>
-        <w:ind w:left="360" w:hanging="220"/>
-        <w:spacing w:after="30"/>
-      </w:pPr>
-      <w:r>
-        <w:rPr>
-          <w:sz w:val="21"/>
-          <w:rFonts w:ascii="Calibri" w:hAnsi="Calibri"/>
-        </w:rPr>
-        <w:t xml:space="preserve">•  Порти 5080 (API) і 54329 (PostgreSQL) вільні; baseline-порти збережено.</w:t>
-      </w:r>
-    </w:p>
-    <w:p>
-      <w:pPr>
-        <w:ind w:left="360" w:hanging="220"/>
-        <w:spacing w:after="30"/>
-      </w:pPr>
-      <w:r>
-        <w:rPr>
-          <w:sz w:val="21"/>
-          <w:rFonts w:ascii="Calibri" w:hAnsi="Calibri"/>
-        </w:rPr>
-        <w:t xml:space="preserve">•  Відкриті навчальні credentials securelab / local-study-password зафіксовано лише для стенда на 127.0.0.1; реальні значення передаються поза Git через env ConnectionStrings__SecureLab.</w:t>
+        <w:t xml:space="preserve">•  infra/.env.example містить лише POSTGRES_PORT=54329. Реального infra/.env немає, і він у .gitignore (git check-ignore -v infra/.env повертає правило) — тобто локальні налаштування не потраплять у Git.</w:t>
+      </w:r>
+    </w:p>
+    <w:p>
+      <w:pPr>
+        <w:ind w:left="360" w:hanging="220"/>
+        <w:spacing w:after="30"/>
+      </w:pPr>
+      <w:r>
+        <w:rPr>
+          <w:sz w:val="21"/>
+          <w:rFonts w:ascii="Calibri" w:hAnsi="Calibri"/>
+        </w:rPr>
+        <w:t xml:space="preserve">•  Порти 5080 (API) і 54329 (PostgreSQL) вільні; змінювати baseline-порти не довелося.</w:t>
+      </w:r>
+    </w:p>
+    <w:p>
+      <w:pPr>
+        <w:ind w:left="360" w:hanging="220"/>
+        <w:spacing w:after="30"/>
+      </w:pPr>
+      <w:r>
+        <w:rPr>
+          <w:sz w:val="21"/>
+          <w:rFonts w:ascii="Calibri" w:hAnsi="Calibri"/>
+        </w:rPr>
+        <w:t xml:space="preserve">•  securelab / local-study-password — це відкриті навчальні дані лише для стенда на 127.0.0.1, не секрет. Справжній рядок підключення за потреби передається поза Git через змінну середовища ConnectionStrings__SecureLab.</w:t>
       </w:r>
     </w:p>
     <w:p>
@@ -435,7 +519,7 @@
           <w:sz w:val="21"/>
           <w:rFonts w:ascii="Calibri" w:hAnsi="Calibri"/>
         </w:rPr>
-        <w:t xml:space="preserve">docker compose --env-file infra/.env.example -f infra/compose.yaml up -d --wait — контейнер postgres піднято й доступний на 127.0.0.1:54329. Перевірка з'єднання й seed-даних:</w:t>
+        <w:t xml:space="preserve">docker compose --env-file infra/.env.example -f infra/compose.yaml up -d --wait — контейнер бази даних піднято й доступний на 127.0.0.1:54329. Перевірка з'єднання і того, що seed-дані на місці (3 інциденти — по одному Low, Medium, High):</w:t>
       </w:r>
     </w:p>
     <w:p>
@@ -456,7 +540,7 @@
                     <pic:cNvPicPr/>
                   </pic:nvPicPr>
                   <pic:blipFill>
-                    <a:blip xmlns:r="http://schemas.openxmlformats.org/officeDocument/2006/relationships" r:embed="R3fdd903dc1a7447a"/>
+                    <a:blip xmlns:r="http://schemas.openxmlformats.org/officeDocument/2006/relationships" r:embed="Rc510d068f5734181"/>
                     <a:stretch>
                       <a:fillRect/>
                     </a:stretch>
@@ -489,7 +573,16 @@
           <w:rFonts w:ascii="Calibri" w:hAnsi="Calibri"/>
           <w:color w:val="555555"/>
         </w:rPr>
-        <w:t xml:space="preserve">psql до 127.0.0.1:54329: БД і роль securelab; у таблиці incidents 3 seed-інциденти (Low/Medium/High по одному).</w:t>
+        <w:t xml:space="preserve">psql до 127.0.0.1:54329: БД і роль securelab; у таблиці incidents рівно 3 seed-інциденти.</w:t>
+      </w:r>
+    </w:p>
+    <w:p>
+      <w:r>
+        <w:rPr>
+          <w:sz w:val="21"/>
+          <w:rFonts w:ascii="Calibri" w:hAnsi="Calibri"/>
+        </w:rPr>
+        <w:t xml:space="preserve">API і база — окремі компоненти. Те, що API запустився, ще не означає, що база доступна, тому далі є окрема перевірка /health.</w:t>
       </w:r>
     </w:p>
     <w:p>
@@ -529,20 +622,20 @@
           <w:sz w:val="21"/>
           <w:rFonts w:ascii="Calibri" w:hAnsi="Calibri"/>
         </w:rPr>
-        <w:t xml:space="preserve">•  Під час першого Development-запуску застосовано готову EF Core migration (InitialCreate) і додано фіксовані seed-дані.</w:t>
-      </w:r>
-    </w:p>
-    <w:p>
-      <w:pPr>
-        <w:ind w:left="360" w:hanging="220"/>
-        <w:spacing w:after="30"/>
-      </w:pPr>
-      <w:r>
-        <w:rPr>
-          <w:sz w:val="21"/>
-          <w:rFonts w:ascii="Calibri" w:hAnsi="Calibri"/>
-        </w:rPr>
-        <w:t xml:space="preserve">•  API слухає http://localhost:5080 (з Properties/launchSettings.json).</w:t>
+        <w:t xml:space="preserve">•  Під час першого запуску в режимі Development застосовується готова EF Core міграція (InitialCreate) і додаються фіксовані seed-дані — окремо це робити не треба.</w:t>
+      </w:r>
+    </w:p>
+    <w:p>
+      <w:pPr>
+        <w:ind w:left="360" w:hanging="220"/>
+        <w:spacing w:after="30"/>
+      </w:pPr>
+      <w:r>
+        <w:rPr>
+          <w:sz w:val="21"/>
+          <w:rFonts w:ascii="Calibri" w:hAnsi="Calibri"/>
+        </w:rPr>
+        <w:t xml:space="preserve">•  API слухає http://localhost:5080 (адресу задано в Properties/launchSettings.json).</w:t>
       </w:r>
     </w:p>
     <w:p>
@@ -552,7 +645,7 @@
           <w:sz w:val="21"/>
           <w:rFonts w:ascii="Calibri" w:hAnsi="Calibri"/>
         </w:rPr>
-        <w:t xml:space="preserve">Readiness endpoint — /health перевіряє з'єднання API з БД:</w:t>
+        <w:t xml:space="preserve">/health робить запит до БД і повертає результат — це доказ, що API реально з'єднується з PostgreSQL:</w:t>
       </w:r>
     </w:p>
     <w:p>
@@ -573,7 +666,7 @@
                     <pic:cNvPicPr/>
                   </pic:nvPicPr>
                   <pic:blipFill>
-                    <a:blip xmlns:r="http://schemas.openxmlformats.org/officeDocument/2006/relationships" r:embed="R18e92f9e55c44395"/>
+                    <a:blip xmlns:r="http://schemas.openxmlformats.org/officeDocument/2006/relationships" r:embed="R780f1ee068654468"/>
                     <a:stretch>
                       <a:fillRect/>
                     </a:stretch>
@@ -615,7 +708,7 @@
           <w:sz w:val="21"/>
           <w:rFonts w:ascii="Calibri" w:hAnsi="Calibri"/>
         </w:rPr>
-        <w:t xml:space="preserve">Відкриваються також: http://localhost:5080/ (браузерний клієнт), /scalar/v1 (інтерактивний OpenAPI), /openapi/v1.json.</w:t>
+        <w:t xml:space="preserve">Також відкриваються: http://localhost:5080/ — браузерний клієнт; /scalar/v1 — інтерактивний OpenAPI; /openapi/v1.json — сам OpenAPI-документ.</w:t>
       </w:r>
     </w:p>
     <w:p>
@@ -636,7 +729,7 @@
                     <pic:cNvPicPr/>
                   </pic:nvPicPr>
                   <pic:blipFill>
-                    <a:blip xmlns:r="http://schemas.openxmlformats.org/officeDocument/2006/relationships" r:embed="R294a5f2471c54453"/>
+                    <a:blip xmlns:r="http://schemas.openxmlformats.org/officeDocument/2006/relationships" r:embed="R45258d8cd03e4ff0"/>
                     <a:stretch>
                       <a:fillRect/>
                     </a:stretch>
@@ -669,7 +762,7 @@
           <w:rFonts w:ascii="Calibri" w:hAnsi="Calibri"/>
           <w:color w:val="555555"/>
         </w:rPr>
-        <w:t xml:space="preserve">Інтерактивний OpenAPI (Scalar) для SecureLab.Api v1: групи Diagnostics, Incidents, Models.</w:t>
+        <w:t xml:space="preserve">Scalar: список операцій API (групи Diagnostics, Incidents) і схеми (Models).</w:t>
       </w:r>
     </w:p>
     <w:p>
@@ -692,13 +785,13 @@
           <w:sz w:val="21"/>
           <w:rFonts w:ascii="Calibri" w:hAnsi="Calibri"/>
         </w:rPr>
-        <w:t xml:space="preserve">Операції виконано через curl (альтернатива .http-клієнту); фактичний клас результату:</w:t>
+        <w:t xml:space="preserve">Через curl виконав основні операції і звірив фактичний клас результату:</w:t>
       </w:r>
     </w:p>
     <w:tbl>
       <w:tblPr>
         <w:tblStyle w:val="TableGrid"/>
-        <w:tblW w:w="9400" w:type="dxa"/>
+        <w:tblW w:w="9200" w:type="dxa"/>
         <w:tblBorders>
           <w:top w:val="single" w:color="AAAAAA" w:sz="4"/>
           <w:bottom w:val="single" w:color="AAAAAA" w:sz="4"/>
@@ -709,14 +802,14 @@
         </w:tblBorders>
       </w:tblPr>
       <w:tblGrid>
-        <w:gridCol w:w="4400"/>
-        <w:gridCol w:w="2400"/>
-        <w:gridCol w:w="2600"/>
+        <w:gridCol w:w="4200"/>
+        <w:gridCol w:w="1700"/>
+        <w:gridCol w:w="3300"/>
       </w:tblGrid>
       <w:tr>
         <w:tc>
           <w:tcPr>
-            <w:tcW w:w="4400" w:type="dxa"/>
+            <w:tcW w:w="4200" w:type="dxa"/>
             <w:shd w:val="clear" w:fill="1F3864"/>
           </w:tcPr>
           <w:p>
@@ -727,13 +820,13 @@
                 <w:b/>
                 <w:color w:val="FFFFFF"/>
               </w:rPr>
-              <w:t xml:space="preserve">Операція</w:t>
-            </w:r>
-          </w:p>
-        </w:tc>
-        <w:tc>
-          <w:tcPr>
-            <w:tcW w:w="2400" w:type="dxa"/>
+              <w:t xml:space="preserve">Запит</w:t>
+            </w:r>
+          </w:p>
+        </w:tc>
+        <w:tc>
+          <w:tcPr>
+            <w:tcW w:w="1700" w:type="dxa"/>
             <w:shd w:val="clear" w:fill="1F3864"/>
           </w:tcPr>
           <w:p>
@@ -750,7 +843,7 @@
         </w:tc>
         <w:tc>
           <w:tcPr>
-            <w:tcW w:w="2600" w:type="dxa"/>
+            <w:tcW w:w="3300" w:type="dxa"/>
             <w:shd w:val="clear" w:fill="1F3864"/>
           </w:tcPr>
           <w:p>
@@ -761,7 +854,7 @@
                 <w:b/>
                 <w:color w:val="FFFFFF"/>
               </w:rPr>
-              <w:t xml:space="preserve">Фактично</w:t>
+              <w:t xml:space="preserve">Фактично — і що це означає</w:t>
             </w:r>
           </w:p>
         </w:tc>
@@ -769,7 +862,7 @@
       <w:tr>
         <w:tc>
           <w:tcPr>
-            <w:tcW w:w="4400" w:type="dxa"/>
+            <w:tcW w:w="4200" w:type="dxa"/>
           </w:tcPr>
           <w:p>
             <w:r>
@@ -783,7 +876,7 @@
         </w:tc>
         <w:tc>
           <w:tcPr>
-            <w:tcW w:w="2400" w:type="dxa"/>
+            <w:tcW w:w="1700" w:type="dxa"/>
           </w:tcPr>
           <w:p>
             <w:r>
@@ -797,7 +890,7 @@
         </w:tc>
         <w:tc>
           <w:tcPr>
-            <w:tcW w:w="2600" w:type="dxa"/>
+            <w:tcW w:w="3300" w:type="dxa"/>
           </w:tcPr>
           <w:p>
             <w:r>
@@ -813,7 +906,7 @@
       <w:tr>
         <w:tc>
           <w:tcPr>
-            <w:tcW w:w="4400" w:type="dxa"/>
+            <w:tcW w:w="4200" w:type="dxa"/>
           </w:tcPr>
           <w:p>
             <w:r>
@@ -827,7 +920,7 @@
         </w:tc>
         <w:tc>
           <w:tcPr>
-            <w:tcW w:w="2400" w:type="dxa"/>
+            <w:tcW w:w="1700" w:type="dxa"/>
           </w:tcPr>
           <w:p>
             <w:r>
@@ -841,15 +934,15 @@
         </w:tc>
         <w:tc>
           <w:tcPr>
-            <w:tcW w:w="2600" w:type="dxa"/>
-          </w:tcPr>
-          <w:p>
-            <w:r>
-              <w:rPr>
-                <w:sz w:val="17"/>
-                <w:rFonts w:ascii="Calibri" w:hAnsi="Calibri"/>
-              </w:rPr>
-              <w:t xml:space="preserve">200 — list-flow, 3 seed-інциденти</w:t>
+            <w:tcW w:w="3300" w:type="dxa"/>
+          </w:tcPr>
+          <w:p>
+            <w:r>
+              <w:rPr>
+                <w:sz w:val="17"/>
+                <w:rFonts w:ascii="Calibri" w:hAnsi="Calibri"/>
+              </w:rPr>
+              <w:t xml:space="preserve">200 — список із 3 seed-інцидентів</w:t>
             </w:r>
           </w:p>
         </w:tc>
@@ -857,7 +950,7 @@
       <w:tr>
         <w:tc>
           <w:tcPr>
-            <w:tcW w:w="4400" w:type="dxa"/>
+            <w:tcW w:w="4200" w:type="dxa"/>
           </w:tcPr>
           <w:p>
             <w:r>
@@ -871,7 +964,7 @@
         </w:tc>
         <w:tc>
           <w:tcPr>
-            <w:tcW w:w="2400" w:type="dxa"/>
+            <w:tcW w:w="1700" w:type="dxa"/>
           </w:tcPr>
           <w:p>
             <w:r>
@@ -885,15 +978,15 @@
         </w:tc>
         <w:tc>
           <w:tcPr>
-            <w:tcW w:w="2600" w:type="dxa"/>
-          </w:tcPr>
-          <w:p>
-            <w:r>
-              <w:rPr>
-                <w:sz w:val="17"/>
-                <w:rFonts w:ascii="Calibri" w:hAnsi="Calibri"/>
-              </w:rPr>
-              <w:t xml:space="preserve">200 — 1 інцидент (Підозрілий лист…, Medium, Triaged)</w:t>
+            <w:tcW w:w="3300" w:type="dxa"/>
+          </w:tcPr>
+          <w:p>
+            <w:r>
+              <w:rPr>
+                <w:sz w:val="17"/>
+                <w:rFonts w:ascii="Calibri" w:hAnsi="Calibri"/>
+              </w:rPr>
+              <w:t xml:space="preserve">200 — 1 інцидент (готовий фільтр працює)</w:t>
             </w:r>
           </w:p>
         </w:tc>
@@ -901,7 +994,7 @@
       <w:tr>
         <w:tc>
           <w:tcPr>
-            <w:tcW w:w="4400" w:type="dxa"/>
+            <w:tcW w:w="4200" w:type="dxa"/>
           </w:tcPr>
           <w:p>
             <w:r>
@@ -915,7 +1008,7 @@
         </w:tc>
         <w:tc>
           <w:tcPr>
-            <w:tcW w:w="2400" w:type="dxa"/>
+            <w:tcW w:w="1700" w:type="dxa"/>
           </w:tcPr>
           <w:p>
             <w:r>
@@ -929,15 +1022,15 @@
         </w:tc>
         <w:tc>
           <w:tcPr>
-            <w:tcW w:w="2600" w:type="dxa"/>
-          </w:tcPr>
-          <w:p>
-            <w:r>
-              <w:rPr>
-                <w:sz w:val="17"/>
-                <w:rFonts w:ascii="Calibri" w:hAnsi="Calibri"/>
-              </w:rPr>
-              <w:t xml:space="preserve">200 — []</w:t>
+            <w:tcW w:w="3300" w:type="dxa"/>
+          </w:tcPr>
+          <w:p>
+            <w:r>
+              <w:rPr>
+                <w:sz w:val="17"/>
+                <w:rFonts w:ascii="Calibri" w:hAnsi="Calibri"/>
+              </w:rPr>
+              <w:t xml:space="preserve">200, порожній масив — коректний результат, не помилка</w:t>
             </w:r>
           </w:p>
         </w:tc>
@@ -945,43 +1038,43 @@
       <w:tr>
         <w:tc>
           <w:tcPr>
-            <w:tcW w:w="4400" w:type="dxa"/>
-          </w:tcPr>
-          <w:p>
-            <w:r>
-              <w:rPr>
-                <w:sz w:val="17"/>
-                <w:rFonts w:ascii="Calibri" w:hAnsi="Calibri"/>
-              </w:rPr>
-              <w:t xml:space="preserve">GET /api/incidents/99999999-9999-9999-9999-999999999999</w:t>
-            </w:r>
-          </w:p>
-        </w:tc>
-        <w:tc>
-          <w:tcPr>
-            <w:tcW w:w="2400" w:type="dxa"/>
-          </w:tcPr>
-          <w:p>
-            <w:r>
-              <w:rPr>
-                <w:sz w:val="17"/>
-                <w:rFonts w:ascii="Calibri" w:hAnsi="Calibri"/>
-              </w:rPr>
-              <w:t xml:space="preserve">404 Problem Details</w:t>
-            </w:r>
-          </w:p>
-        </w:tc>
-        <w:tc>
-          <w:tcPr>
-            <w:tcW w:w="2600" w:type="dxa"/>
-          </w:tcPr>
-          <w:p>
-            <w:r>
-              <w:rPr>
-                <w:sz w:val="17"/>
-                <w:rFonts w:ascii="Calibri" w:hAnsi="Calibri"/>
-              </w:rPr>
-              <w:t xml:space="preserve">404 — application/problem+json</w:t>
+            <w:tcW w:w="4200" w:type="dxa"/>
+          </w:tcPr>
+          <w:p>
+            <w:r>
+              <w:rPr>
+                <w:sz w:val="17"/>
+                <w:rFonts w:ascii="Calibri" w:hAnsi="Calibri"/>
+              </w:rPr>
+              <w:t xml:space="preserve">GET /api/incidents/99999999-…-999999999999</w:t>
+            </w:r>
+          </w:p>
+        </w:tc>
+        <w:tc>
+          <w:tcPr>
+            <w:tcW w:w="1700" w:type="dxa"/>
+          </w:tcPr>
+          <w:p>
+            <w:r>
+              <w:rPr>
+                <w:sz w:val="17"/>
+                <w:rFonts w:ascii="Calibri" w:hAnsi="Calibri"/>
+              </w:rPr>
+              <w:t xml:space="preserve">404</w:t>
+            </w:r>
+          </w:p>
+        </w:tc>
+        <w:tc>
+          <w:tcPr>
+            <w:tcW w:w="3300" w:type="dxa"/>
+          </w:tcPr>
+          <w:p>
+            <w:r>
+              <w:rPr>
+                <w:sz w:val="17"/>
+                <w:rFonts w:ascii="Calibri" w:hAnsi="Calibri"/>
+              </w:rPr>
+              <w:t xml:space="preserve">404 Problem Details — відсутній ресурс не маскується під успіх</w:t>
             </w:r>
           </w:p>
         </w:tc>
@@ -989,7 +1082,7 @@
       <w:tr>
         <w:tc>
           <w:tcPr>
-            <w:tcW w:w="4400" w:type="dxa"/>
+            <w:tcW w:w="4200" w:type="dxa"/>
           </w:tcPr>
           <w:p>
             <w:r>
@@ -1003,29 +1096,29 @@
         </w:tc>
         <w:tc>
           <w:tcPr>
-            <w:tcW w:w="2400" w:type="dxa"/>
-          </w:tcPr>
-          <w:p>
-            <w:r>
-              <w:rPr>
-                <w:sz w:val="17"/>
-                <w:rFonts w:ascii="Calibri" w:hAnsi="Calibri"/>
-              </w:rPr>
-              <w:t xml:space="preserve">400 Validation Problem Details</w:t>
-            </w:r>
-          </w:p>
-        </w:tc>
-        <w:tc>
-          <w:tcPr>
-            <w:tcW w:w="2600" w:type="dxa"/>
-          </w:tcPr>
-          <w:p>
-            <w:r>
-              <w:rPr>
-                <w:sz w:val="17"/>
-                <w:rFonts w:ascii="Calibri" w:hAnsi="Calibri"/>
-              </w:rPr>
-              <w:t xml:space="preserve">400 — errors.status</w:t>
+            <w:tcW w:w="1700" w:type="dxa"/>
+          </w:tcPr>
+          <w:p>
+            <w:r>
+              <w:rPr>
+                <w:sz w:val="17"/>
+                <w:rFonts w:ascii="Calibri" w:hAnsi="Calibri"/>
+              </w:rPr>
+              <w:t xml:space="preserve">400</w:t>
+            </w:r>
+          </w:p>
+        </w:tc>
+        <w:tc>
+          <w:tcPr>
+            <w:tcW w:w="3300" w:type="dxa"/>
+          </w:tcPr>
+          <w:p>
+            <w:r>
+              <w:rPr>
+                <w:sz w:val="17"/>
+                <w:rFonts w:ascii="Calibri" w:hAnsi="Calibri"/>
+              </w:rPr>
+              <w:t xml:space="preserve">400 — невідоме значення перевіряє сервер, а не тільки &lt;select&gt;</w:t>
             </w:r>
           </w:p>
         </w:tc>
@@ -1033,7 +1126,7 @@
       <w:tr>
         <w:tc>
           <w:tcPr>
-            <w:tcW w:w="4400" w:type="dxa"/>
+            <w:tcW w:w="4200" w:type="dxa"/>
           </w:tcPr>
           <w:p>
             <w:r>
@@ -1047,29 +1140,29 @@
         </w:tc>
         <w:tc>
           <w:tcPr>
-            <w:tcW w:w="2400" w:type="dxa"/>
-          </w:tcPr>
-          <w:p>
-            <w:r>
-              <w:rPr>
-                <w:sz w:val="17"/>
-                <w:rFonts w:ascii="Calibri" w:hAnsi="Calibri"/>
-              </w:rPr>
-              <w:t xml:space="preserve">501 у baseline</w:t>
-            </w:r>
-          </w:p>
-        </w:tc>
-        <w:tc>
-          <w:tcPr>
-            <w:tcW w:w="2600" w:type="dxa"/>
-          </w:tcPr>
-          <w:p>
-            <w:r>
-              <w:rPr>
-                <w:sz w:val="17"/>
-                <w:rFonts w:ascii="Calibri" w:hAnsi="Calibri"/>
-              </w:rPr>
-              <w:t xml:space="preserve">501 — точка розширення (реалізується в етапі 3)</w:t>
+            <w:tcW w:w="1700" w:type="dxa"/>
+          </w:tcPr>
+          <w:p>
+            <w:r>
+              <w:rPr>
+                <w:sz w:val="17"/>
+                <w:rFonts w:ascii="Calibri" w:hAnsi="Calibri"/>
+              </w:rPr>
+              <w:t xml:space="preserve">501 (baseline)</w:t>
+            </w:r>
+          </w:p>
+        </w:tc>
+        <w:tc>
+          <w:tcPr>
+            <w:tcW w:w="3300" w:type="dxa"/>
+          </w:tcPr>
+          <w:p>
+            <w:r>
+              <w:rPr>
+                <w:sz w:val="17"/>
+                <w:rFonts w:ascii="Calibri" w:hAnsi="Calibri"/>
+              </w:rPr>
+              <w:t xml:space="preserve">501 — точка розширення, яку реалізую в етапі 3</w:t>
             </w:r>
           </w:p>
         </w:tc>
@@ -1100,20 +1193,20 @@
           <w:sz w:val="21"/>
           <w:rFonts w:ascii="Calibri" w:hAnsi="Calibri"/>
         </w:rPr>
-        <w:t xml:space="preserve">•  dotnet run --no-build --project src/SecureLab.Api -- --reset-database — застосовує міграції, очищує відомі навчальні таблиці й повторно заповнює seed; працює лише в Development.</w:t>
-      </w:r>
-    </w:p>
-    <w:p>
-      <w:pPr>
-        <w:ind w:left="360" w:hanging="220"/>
-        <w:spacing w:after="30"/>
-      </w:pPr>
-      <w:r>
-        <w:rPr>
-          <w:sz w:val="21"/>
-          <w:rFonts w:ascii="Calibri" w:hAnsi="Calibri"/>
-        </w:rPr>
-        <w:t xml:space="preserve">•  Після reset GET /api/incidents знову дає той самий list-flow з 3 seed-інцидентами.</w:t>
+        <w:t xml:space="preserve">•  dotnet run --no-build --project src/SecureLab.Api -- --reset-database — застосовує міграції, очищує відомі навчальні таблиці й повторно заповнює seed. Команда навмисно працює лише в Development.</w:t>
+      </w:r>
+    </w:p>
+    <w:p>
+      <w:pPr>
+        <w:ind w:left="360" w:hanging="220"/>
+        <w:spacing w:after="30"/>
+      </w:pPr>
+      <w:r>
+        <w:rPr>
+          <w:sz w:val="21"/>
+          <w:rFonts w:ascii="Calibri" w:hAnsi="Calibri"/>
+        </w:rPr>
+        <w:t xml:space="preserve">•  Після reset GET /api/incidents знову дає той самий список із 3 інцидентів.</w:t>
       </w:r>
     </w:p>
     <w:p>
@@ -1153,7 +1246,7 @@
           <w:sz w:val="21"/>
           <w:rFonts w:ascii="Calibri" w:hAnsi="Calibri"/>
         </w:rPr>
-        <w:t xml:space="preserve">•  PostgreSQL — docker compose ... down (без -v зберігає навчальні дані в іменованому volume).</w:t>
+        <w:t xml:space="preserve">•  PostgreSQL — docker compose ... down (без -v навчальні дані зберігаються в іменованому volume).</w:t>
       </w:r>
     </w:p>
     <w:p>
@@ -1248,7 +1341,7 @@
                 <w:sz w:val="17"/>
                 <w:rFonts w:ascii="Calibri" w:hAnsi="Calibri"/>
               </w:rPr>
-              <w:t xml:space="preserve">lab/1-system (фінальний стан злито в main)</w:t>
+              <w:t xml:space="preserve">lab/1-system (потім злито в main)</w:t>
             </w:r>
           </w:p>
         </w:tc>
@@ -1308,7 +1401,7 @@
                 <w:sz w:val="17"/>
                 <w:rFonts w:ascii="Calibri" w:hAnsi="Calibri"/>
               </w:rPr>
-              <w:t xml:space="preserve">відкриваються; /health → 200 healthy/reachable</w:t>
+              <w:t xml:space="preserve">відкриваються; /health → 200 healthy / reachable</w:t>
             </w:r>
           </w:p>
         </w:tc>
@@ -1324,7 +1417,7 @@
                 <w:sz w:val="17"/>
                 <w:rFonts w:ascii="Calibri" w:hAnsi="Calibri"/>
               </w:rPr>
-              <w:t xml:space="preserve">reset відтворює list-flow</w:t>
+              <w:t xml:space="preserve">reset відтворює список</w:t>
             </w:r>
           </w:p>
         </w:tc>
@@ -1338,7 +1431,7 @@
                 <w:sz w:val="17"/>
                 <w:rFonts w:ascii="Calibri" w:hAnsi="Calibri"/>
               </w:rPr>
-              <w:t xml:space="preserve">після --reset-database GET /api/incidents знову дає 3 seed-інциденти</w:t>
+              <w:t xml:space="preserve">після --reset-database GET /api/incidents знову дає 3 інциденти</w:t>
             </w:r>
           </w:p>
         </w:tc>
@@ -1412,7 +1505,7 @@
           <w:sz w:val="21"/>
           <w:rFonts w:ascii="Calibri" w:hAnsi="Calibri"/>
         </w:rPr>
-        <w:t xml:space="preserve">Досліджено перегляд одного інциденту: GET /api/incidents/{id} разом із гілкою відсутнього ресурсу. Успішна гілка — seed-інцидент 20000000-0000-0000-0000-000000000003; гілка відсутнього ресурсу — синтаксично коректний UUID aaaaaaaa-aaaa-4aaa-8aaa-aaaaaaaaaaaa, якого немає в seed.</w:t>
+        <w:t xml:space="preserve">Дослідив перегляд одного інциденту: GET /api/incidents/{id}. Тут id — частина URL, відповідь має контракт деталей одного інциденту, а не список. Для успішної гілки взяв seed-інцидент 20000000-0000-0000-0000-000000000003; для гілки відсутнього ресурсу — синтаксично коректний UUID aaaaaaaa-aaaa-4aaa-8aaa-aaaaaaaaaaaa, якого в базі немає.</w:t>
       </w:r>
     </w:p>
     <w:p>
@@ -1422,7 +1515,7 @@
           <w:sz w:val="21"/>
           <w:rFonts w:ascii="Calibri" w:hAnsi="Calibri"/>
         </w:rPr>
-        <w:t xml:space="preserve">Маршрут як ланцюжок доказів:</w:t>
+        <w:t xml:space="preserve">Маршрут як ланцюжок (кожна стрілка — окрема відповідальність і окреме джерело доказів):</w:t>
       </w:r>
     </w:p>
     <w:p>
@@ -1435,7 +1528,7 @@
           <w:rFonts w:ascii="Consolas" w:hAnsi="Consolas"/>
           <w:sz w:val="16"/>
         </w:rPr>
-        <w:t xml:space="preserve">натискання картки інциденту</w:t>
+        <w:t xml:space="preserve">клік по картці інциденту</w:t>
       </w:r>
     </w:p>
     <w:p>
@@ -1448,7 +1541,7 @@
           <w:rFonts w:ascii="Consolas" w:hAnsi="Consolas"/>
           <w:sz w:val="16"/>
         </w:rPr>
-        <w:t xml:space="preserve">  -&gt; loadIncidentDetails() у Client/app.js</w:t>
+        <w:t xml:space="preserve">  -&gt; loadIncidentDetails() у Client/app.js         (fetch: method GET, URL, без body)</w:t>
       </w:r>
     </w:p>
     <w:p>
@@ -1461,7 +1554,7 @@
           <w:rFonts w:ascii="Consolas" w:hAnsi="Consolas"/>
           <w:sz w:val="16"/>
         </w:rPr>
-        <w:t xml:space="preserve">  -&gt; GET /api/incidents/{id}                       (fetch, без body)</w:t>
+        <w:t xml:space="preserve">  -&gt; IncidentEndpoints.GetDetailsAsync             (маршрут /{id:guid}; якщо запит дав null -&gt; 404)</w:t>
       </w:r>
     </w:p>
     <w:p>
@@ -1474,7 +1567,7 @@
           <w:rFonts w:ascii="Consolas" w:hAnsi="Consolas"/>
           <w:sz w:val="16"/>
         </w:rPr>
-        <w:t xml:space="preserve">  -&gt; IncidentEndpoints.GetDetailsAsync             (routing; обмеження :guid)</w:t>
+        <w:t xml:space="preserve">  -&gt; IncidentQueries.GetDetailsAsync               (AsNoTracking, Where за id, SingleOrDefaultAsync)</w:t>
       </w:r>
     </w:p>
     <w:p>
@@ -1487,7 +1580,7 @@
           <w:rFonts w:ascii="Consolas" w:hAnsi="Consolas"/>
           <w:sz w:val="16"/>
         </w:rPr>
-        <w:t xml:space="preserve">  -&gt; IncidentQueries.GetDetailsAsync               (AsNoTracking, Where за id, SingleOrDefaultAsync)</w:t>
+        <w:t xml:space="preserve">  -&gt; SecureLabDbContext.Incidents  -&gt;  таблиця incidents у PostgreSQL</w:t>
       </w:r>
     </w:p>
     <w:p>
@@ -1500,7 +1593,7 @@
           <w:rFonts w:ascii="Consolas" w:hAnsi="Consolas"/>
           <w:sz w:val="16"/>
         </w:rPr>
-        <w:t xml:space="preserve">  -&gt; SecureLabDbContext.Incidents  -&gt;  PostgreSQL: таблиця incidents</w:t>
+        <w:t xml:space="preserve">  -&gt; IncidentDetailsResponse (окремий DTO)  -&gt;  JSON</w:t>
       </w:r>
     </w:p>
     <w:p>
@@ -1513,19 +1606,6 @@
           <w:rFonts w:ascii="Consolas" w:hAnsi="Consolas"/>
           <w:sz w:val="16"/>
         </w:rPr>
-        <w:t xml:space="preserve">  -&gt; IncidentDetailsResponse  -&gt;  JSON</w:t>
-      </w:r>
-    </w:p>
-    <w:p>
-      <w:pPr>
-        <w:shd w:val="clear" w:fill="F2F2F2"/>
-        <w:spacing w:before="0" w:after="0"/>
-      </w:pPr>
-      <w:r>
-        <w:rPr>
-          <w:rFonts w:ascii="Consolas" w:hAnsi="Consolas"/>
-          <w:sz w:val="16"/>
-        </w:rPr>
         <w:t xml:space="preserve">  -&gt; renderIncidentDetails()  -&gt;  DOM через textContent / document.createTextNode</w:t>
       </w:r>
     </w:p>
@@ -1550,7 +1630,7 @@
           <w:sz w:val="21"/>
           <w:rFonts w:ascii="Calibri" w:hAnsi="Calibri"/>
         </w:rPr>
-        <w:t xml:space="preserve">У вбудованому браузері на http://localhost:5080/ під час відкриття картки «Перевірка журналу комп'ютерного класу» вкладка Network показала запити:</w:t>
+        <w:t xml:space="preserve">У браузері на http://localhost:5080/ відкрив вкладку Network, натиснув картку «Перевірка журналу комп'ютерного класу» і побачив запити:</w:t>
       </w:r>
     </w:p>
     <w:tbl>
@@ -1765,7 +1845,7 @@
           <w:sz w:val="21"/>
           <w:rFonts w:ascii="Calibri" w:hAnsi="Calibri"/>
         </w:rPr>
-        <w:t xml:space="preserve">Успішна гілка — method GET, повний URL, 200, Content-Type application/json, без request body:</w:t>
+        <w:t xml:space="preserve">Успішна гілка — GET, повний URL, 200, Content-Type application/json, request body відсутній (це властивість цього контракту, а не правило для всіх запитів):</w:t>
       </w:r>
     </w:p>
     <w:p>
@@ -1786,7 +1866,7 @@
                     <pic:cNvPicPr/>
                   </pic:nvPicPr>
                   <pic:blipFill>
-                    <a:blip xmlns:r="http://schemas.openxmlformats.org/officeDocument/2006/relationships" r:embed="R4471f3df2c154193"/>
+                    <a:blip xmlns:r="http://schemas.openxmlformats.org/officeDocument/2006/relationships" r:embed="R7d7bfe25d561461b"/>
                     <a:stretch>
                       <a:fillRect/>
                     </a:stretch>
@@ -1819,7 +1899,7 @@
           <w:rFonts w:ascii="Calibri" w:hAnsi="Calibri"/>
           <w:color w:val="555555"/>
         </w:rPr>
-        <w:t xml:space="preserve">GET /api/incidents/{id} -&gt; 200; body: id, title, description із фрагментом &lt;script&gt;, severity, status, ownerDisplayName, один публічний коментар. Полів ownerUserId та email немає.</w:t>
+        <w:t xml:space="preserve">GET /api/incidents/{id} → 200. У тілі: id, title, description (із фрагментом &lt;script&gt;), severity, status, ownerDisplayName, один публічний коментар. Полів ownerUserId та email немає.</w:t>
       </w:r>
     </w:p>
     <w:p>
@@ -1829,7 +1909,7 @@
           <w:sz w:val="21"/>
           <w:rFonts w:ascii="Calibri" w:hAnsi="Calibri"/>
         </w:rPr>
-        <w:t xml:space="preserve">Гілка відсутнього ресурсу — виклик іншого UUID:</w:t>
+        <w:t xml:space="preserve">Гілка відсутнього ресурсу — той самий endpoint, але з UUID, якого немає:</w:t>
       </w:r>
     </w:p>
     <w:p>
@@ -1850,7 +1930,7 @@
                     <pic:cNvPicPr/>
                   </pic:nvPicPr>
                   <pic:blipFill>
-                    <a:blip xmlns:r="http://schemas.openxmlformats.org/officeDocument/2006/relationships" r:embed="R7a8be6bdb9ab4474"/>
+                    <a:blip xmlns:r="http://schemas.openxmlformats.org/officeDocument/2006/relationships" r:embed="Rfdcc11a5456d4329"/>
                     <a:stretch>
                       <a:fillRect/>
                     </a:stretch>
@@ -1883,7 +1963,16 @@
           <w:rFonts w:ascii="Calibri" w:hAnsi="Calibri"/>
           <w:color w:val="555555"/>
         </w:rPr>
-        <w:t xml:space="preserve">GET /api/incidents/aaaaaaaa-… -&gt; 404, application/problem+json, поле traceId цього запуску.</w:t>
+        <w:t xml:space="preserve">GET /api/incidents/aaaaaaaa-… → 404, Content-Type application/problem+json, у тілі є traceId цього запуску.</w:t>
+      </w:r>
+    </w:p>
+    <w:p>
+      <w:r>
+        <w:rPr>
+          <w:sz w:val="21"/>
+          <w:rFonts w:ascii="Calibri" w:hAnsi="Calibri"/>
+        </w:rPr>
+        <w:t xml:space="preserve">Отже, некоректний параметр (400) і відсутній ресурс (404) — це різні ситуації з різним кодом.</w:t>
       </w:r>
     </w:p>
     <w:p>
@@ -1897,46 +1986,46 @@
           <w:rFonts w:ascii="Calibri" w:hAnsi="Calibri"/>
           <w:color w:val="2E4A6B"/>
         </w:rPr>
-        <w:t>3. Зіставлення request з endpoint і application layer</w:t>
-      </w:r>
-    </w:p>
-    <w:p>
-      <w:pPr>
-        <w:ind w:left="360" w:hanging="220"/>
-        <w:spacing w:after="30"/>
-      </w:pPr>
-      <w:r>
-        <w:rPr>
-          <w:sz w:val="21"/>
-          <w:rFonts w:ascii="Calibri" w:hAnsi="Calibri"/>
-        </w:rPr>
-        <w:t xml:space="preserve">•  src/SecureLab.Api/Presentation/Endpoints/IncidentEndpoints.cs: група з префіксом /api/incidents; MapGet("/{id:guid}", GetDetailsAsync). Обмеження :guid відсіює синтаксично некоректний id ще до обробника; результат null із query перетворюється на 404 Problem Details, а не 400.</w:t>
-      </w:r>
-    </w:p>
-    <w:p>
-      <w:pPr>
-        <w:ind w:left="360" w:hanging="220"/>
-        <w:spacing w:after="30"/>
-      </w:pPr>
-      <w:r>
-        <w:rPr>
-          <w:sz w:val="21"/>
-          <w:rFonts w:ascii="Calibri" w:hAnsi="Calibri"/>
-        </w:rPr>
-        <w:t xml:space="preserve">•  src/SecureLab.Api/Application/Incidents/IncidentQueries.cs: GetDetailsAsync починає запит від dbContext.Incidents.AsNoTracking(), відбирає інцидент через Where за id, проєктує дозволені поля в IncidentDetailsResponse і завершує через SingleOrDefaultAsync. Однойменні endpoint- і query-методи — різні типи.</w:t>
-      </w:r>
-    </w:p>
-    <w:p>
-      <w:pPr>
-        <w:ind w:left="360" w:hanging="220"/>
-        <w:spacing w:after="30"/>
-      </w:pPr>
-      <w:r>
-        <w:rPr>
-          <w:sz w:val="21"/>
-          <w:rFonts w:ascii="Calibri" w:hAnsi="Calibri"/>
-        </w:rPr>
-        <w:t xml:space="preserve">•  src/SecureLab.Api/Data/SecureLabDbContext.cs: властивість Incidents — DbSet&lt;Incident&gt;; OnModelCreating: entity.ToTable("incidents"), Severity/Status — HasConversion&lt;string&gt;() (текст у PostgreSQL).</w:t>
+        <w:t>3. Зіставлення запиту з кодом кожного рівня</w:t>
+      </w:r>
+    </w:p>
+    <w:p>
+      <w:pPr>
+        <w:ind w:left="360" w:hanging="220"/>
+        <w:spacing w:after="30"/>
+      </w:pPr>
+      <w:r>
+        <w:rPr>
+          <w:sz w:val="21"/>
+          <w:rFonts w:ascii="Calibri" w:hAnsi="Calibri"/>
+        </w:rPr>
+        <w:t xml:space="preserve">•  IncidentEndpoints.cs: група маршрутів має префікс /api/incidents; рядок MapGet("/{id:guid}", GetDetailsAsync) відповідає на GET /api/incidents/{id}. Обмеження :guid означає, що id має бути коректним GUID — інакше відповідь формується ще до обробника. Якщо запит до БД повернув null, метод формує 404 Problem Details, а не 400.</w:t>
+      </w:r>
+    </w:p>
+    <w:p>
+      <w:pPr>
+        <w:ind w:left="360" w:hanging="220"/>
+        <w:spacing w:after="30"/>
+      </w:pPr>
+      <w:r>
+        <w:rPr>
+          <w:sz w:val="21"/>
+          <w:rFonts w:ascii="Calibri" w:hAnsi="Calibri"/>
+        </w:rPr>
+        <w:t xml:space="preserve">•  IncidentQueries.cs, метод GetDetailsAsync: запит починається від dbContext.Incidents.AsNoTracking() (читання без відстеження змін), відбирає інцидент через Where за id, проєктує лише дозволені поля в IncidentDetailsResponse і виконується через SingleOrDefaultAsync. Однойменний метод в endpoint і в query — це різні методи різних типів.</w:t>
+      </w:r>
+    </w:p>
+    <w:p>
+      <w:pPr>
+        <w:ind w:left="360" w:hanging="220"/>
+        <w:spacing w:after="30"/>
+      </w:pPr>
+      <w:r>
+        <w:rPr>
+          <w:sz w:val="21"/>
+          <w:rFonts w:ascii="Calibri" w:hAnsi="Calibri"/>
+        </w:rPr>
+        <w:t xml:space="preserve">•  SecureLabDbContext.cs: властивість Incidents — це DbSet&lt;Incident&gt;; в OnModelCreating entity.ToTable("incidents") прив'язує тип до таблиці, а Severity і Status зберігаються як текст (HasConversion&lt;string&gt;()).</w:t>
       </w:r>
     </w:p>
     <w:p>
@@ -1971,7 +2060,7 @@
                     <pic:cNvPicPr/>
                   </pic:nvPicPr>
                   <pic:blipFill>
-                    <a:blip xmlns:r="http://schemas.openxmlformats.org/officeDocument/2006/relationships" r:embed="R652b710df1ce46e3"/>
+                    <a:blip xmlns:r="http://schemas.openxmlformats.org/officeDocument/2006/relationships" r:embed="Rad1dca8e43854258"/>
                     <a:stretch>
                       <a:fillRect/>
                     </a:stretch>
@@ -2004,16 +2093,16 @@
           <w:rFonts w:ascii="Calibri" w:hAnsi="Calibri"/>
           <w:color w:val="555555"/>
         </w:rPr>
-        <w:t xml:space="preserve">psql: розподіл за severity (High, Low, Medium — лексикографічний порядок SQL); коментар Admin має is_internal = t.</w:t>
-      </w:r>
-    </w:p>
-    <w:p>
-      <w:r>
-        <w:rPr>
-          <w:sz w:val="21"/>
-          <w:rFonts w:ascii="Calibri" w:hAnsi="Calibri"/>
-        </w:rPr>
-        <w:t xml:space="preserve">id, title, severity, status seed-інциденту збігаються з JSON успішної гілки. Дані SQL-командою не змінювалися.</w:t>
+        <w:t xml:space="preserve">psql: SELECT за severity дає рівні в порядку тексту (High, Low, Medium); коментар автора Admin має is_internal = t.</w:t>
+      </w:r>
+    </w:p>
+    <w:p>
+      <w:r>
+        <w:rPr>
+          <w:sz w:val="21"/>
+          <w:rFonts w:ascii="Calibri" w:hAnsi="Calibri"/>
+        </w:rPr>
+        <w:t xml:space="preserve">id, title, severity і status seed-інциденту в базі збігаються з тим, що повернув API в успішній гілці. Дані я не змінював — лише читав.</w:t>
       </w:r>
     </w:p>
     <w:p>
@@ -2036,16 +2125,17 @@
           <w:sz w:val="21"/>
           <w:rFonts w:ascii="Calibri" w:hAnsi="Calibri"/>
         </w:rPr>
-        <w:t xml:space="preserve">IncidentDetailsResponse містить Id, Title, Description, Severity, Status, OccurredAtUtc, CreatedAtUtc, OwnerDisplayName і колекцію дозволених Comments. Він не містить OwnerUserId, email власника та внутрішніх коментарів — це видно у відповіді (розділ 2) і підтверджено SQL (коментар Admin з is_internal = t у JSON відсутній).</w:t>
-      </w:r>
-    </w:p>
-    <w:p>
-      <w:r>
-        <w:rPr>
-          <w:sz w:val="21"/>
-          <w:rFonts w:ascii="Calibri" w:hAnsi="Calibri"/>
-        </w:rPr>
-        <w:t xml:space="preserve">У Client/app.js renderIncidentDetails створює DOM-вузли й записує текст лише через textContent або document.createTextNode, тому фрагмент &lt;script&gt; у полі description відображається як текст:</w:t>
+        <w:t xml:space="preserve">IncidentDetailsResponse містить: Id, Title, Description, Severity, Status, OccurredAtUtc, CreatedAtUtc, OwnerDisplayName і колекцію дозволених коментарів. Він НЕ містить OwnerUserId, email власника та внутрішніх коментарів. Це видно і у відповіді (розділ 2), і в SQL: коментар Admin із is_internal = t у JSON відсутній. Явна проєкція в окремий DTO зменшує ризик випадково віддати зайве.</w:t>
+      </w:r>
+    </w:p>
+    <w:p>
+      <w:r>
+        <w:rPr>
+          <w:b/>
+          <w:sz w:val="21"/>
+          <w:rFonts w:ascii="Calibri" w:hAnsi="Calibri"/>
+        </w:rPr>
+        <w:t xml:space="preserve">У Client/app.js функція renderIncidentDetails створює DOM-вузли й записує текст лише через textContent / document.createTextNode. Тому навіть якщо в описі є символи &lt;script&gt;, браузер покаже їх як текст, а не виконає. Seed-інцидент навмисно містить такий рядок:</w:t>
       </w:r>
     </w:p>
     <w:p>
@@ -2066,7 +2156,7 @@
                     <pic:cNvPicPr/>
                   </pic:nvPicPr>
                   <pic:blipFill>
-                    <a:blip xmlns:r="http://schemas.openxmlformats.org/officeDocument/2006/relationships" r:embed="Rfbbf7220031c4d1c"/>
+                    <a:blip xmlns:r="http://schemas.openxmlformats.org/officeDocument/2006/relationships" r:embed="Rd554443f8e6d44f5"/>
                     <a:stretch>
                       <a:fillRect/>
                     </a:stretch>
@@ -2113,7 +2203,7 @@
           <w:rFonts w:ascii="Calibri" w:hAnsi="Calibri"/>
           <w:color w:val="2E4A6B"/>
         </w:rPr>
-        <w:t>6. Таблиця меж довіри (details-потік)</w:t>
+        <w:t>6. Таблиця меж довіри (маршрут details)</w:t>
       </w:r>
     </w:p>
     <w:tbl>
@@ -2130,15 +2220,15 @@
         </w:tblBorders>
       </w:tblPr>
       <w:tblGrid>
-        <w:gridCol w:w="1700"/>
         <w:gridCol w:w="1650"/>
-        <w:gridCol w:w="2850"/>
-        <w:gridCol w:w="3200"/>
+        <w:gridCol w:w="1600"/>
+        <w:gridCol w:w="2900"/>
+        <w:gridCol w:w="3250"/>
       </w:tblGrid>
       <w:tr>
         <w:tc>
           <w:tcPr>
-            <w:tcW w:w="1700" w:type="dxa"/>
+            <w:tcW w:w="1650" w:type="dxa"/>
             <w:shd w:val="clear" w:fill="1F3864"/>
           </w:tcPr>
           <w:p>
@@ -2149,13 +2239,13 @@
                 <w:b/>
                 <w:color w:val="FFFFFF"/>
               </w:rPr>
-              <w:t xml:space="preserve">Межа / перехід</w:t>
-            </w:r>
-          </w:p>
-        </w:tc>
-        <w:tc>
-          <w:tcPr>
-            <w:tcW w:w="1650" w:type="dxa"/>
+              <w:t xml:space="preserve">Перехід</w:t>
+            </w:r>
+          </w:p>
+        </w:tc>
+        <w:tc>
+          <w:tcPr>
+            <w:tcW w:w="1600" w:type="dxa"/>
             <w:shd w:val="clear" w:fill="1F3864"/>
           </w:tcPr>
           <w:p>
@@ -2172,7 +2262,7 @@
         </w:tc>
         <w:tc>
           <w:tcPr>
-            <w:tcW w:w="2850" w:type="dxa"/>
+            <w:tcW w:w="2900" w:type="dxa"/>
             <w:shd w:val="clear" w:fill="1F3864"/>
           </w:tcPr>
           <w:p>
@@ -2183,13 +2273,13 @@
                 <w:b/>
                 <w:color w:val="FFFFFF"/>
               </w:rPr>
-              <w:t xml:space="preserve">Що не можна припускати</w:t>
-            </w:r>
-          </w:p>
-        </w:tc>
-        <w:tc>
-          <w:tcPr>
-            <w:tcW w:w="3200" w:type="dxa"/>
+              <w:t xml:space="preserve">Чого не можна припускати</w:t>
+            </w:r>
+          </w:p>
+        </w:tc>
+        <w:tc>
+          <w:tcPr>
+            <w:tcW w:w="3250" w:type="dxa"/>
             <w:shd w:val="clear" w:fill="1F3864"/>
           </w:tcPr>
           <w:p>
@@ -2200,7 +2290,7 @@
                 <w:b/>
                 <w:color w:val="FFFFFF"/>
               </w:rPr>
-              <w:t xml:space="preserve">Контроль у дослідженому маршруті</w:t>
+              <w:t xml:space="preserve">Контроль на маршруті</w:t>
             </w:r>
           </w:p>
         </w:tc>
@@ -2208,7 +2298,7 @@
       <w:tr>
         <w:tc>
           <w:tcPr>
-            <w:tcW w:w="1700" w:type="dxa"/>
+            <w:tcW w:w="1650" w:type="dxa"/>
           </w:tcPr>
           <w:p>
             <w:r>
@@ -2222,7 +2312,7 @@
         </w:tc>
         <w:tc>
           <w:tcPr>
-            <w:tcW w:w="1650" w:type="dxa"/>
+            <w:tcW w:w="1600" w:type="dxa"/>
           </w:tcPr>
           <w:p>
             <w:r>
@@ -2236,7 +2326,7 @@
         </w:tc>
         <w:tc>
           <w:tcPr>
-            <w:tcW w:w="2850" w:type="dxa"/>
+            <w:tcW w:w="2900" w:type="dxa"/>
           </w:tcPr>
           <w:p>
             <w:r>
@@ -2250,15 +2340,15 @@
         </w:tc>
         <w:tc>
           <w:tcPr>
-            <w:tcW w:w="3200" w:type="dxa"/>
-          </w:tcPr>
-          <w:p>
-            <w:r>
-              <w:rPr>
-                <w:sz w:val="17"/>
-                <w:rFonts w:ascii="Calibri" w:hAnsi="Calibri"/>
-              </w:rPr>
-              <w:t xml:space="preserve">маршрутне обмеження :guid + серверна обробка відсутнього ресурсу (404)</w:t>
+            <w:tcW w:w="3250" w:type="dxa"/>
+          </w:tcPr>
+          <w:p>
+            <w:r>
+              <w:rPr>
+                <w:sz w:val="17"/>
+                <w:rFonts w:ascii="Calibri" w:hAnsi="Calibri"/>
+              </w:rPr>
+              <w:t xml:space="preserve">обмеження :guid + обробка відсутнього ресурсу (404)</w:t>
             </w:r>
           </w:p>
         </w:tc>
@@ -2266,7 +2356,7 @@
       <w:tr>
         <w:tc>
           <w:tcPr>
-            <w:tcW w:w="1700" w:type="dxa"/>
+            <w:tcW w:w="1650" w:type="dxa"/>
           </w:tcPr>
           <w:p>
             <w:r>
@@ -2280,7 +2370,7 @@
         </w:tc>
         <w:tc>
           <w:tcPr>
-            <w:tcW w:w="1650" w:type="dxa"/>
+            <w:tcW w:w="1600" w:type="dxa"/>
           </w:tcPr>
           <w:p>
             <w:r>
@@ -2294,7 +2384,7 @@
         </w:tc>
         <w:tc>
           <w:tcPr>
-            <w:tcW w:w="2850" w:type="dxa"/>
+            <w:tcW w:w="2900" w:type="dxa"/>
           </w:tcPr>
           <w:p>
             <w:r>
@@ -2308,15 +2398,15 @@
         </w:tc>
         <w:tc>
           <w:tcPr>
-            <w:tcW w:w="3200" w:type="dxa"/>
-          </w:tcPr>
-          <w:p>
-            <w:r>
-              <w:rPr>
-                <w:sz w:val="17"/>
-                <w:rFonts w:ascii="Calibri" w:hAnsi="Calibri"/>
-              </w:rPr>
-              <w:t xml:space="preserve">параметризація EF Core, AsNoTracking(), явна проєкція в DTO</w:t>
+            <w:tcW w:w="3250" w:type="dxa"/>
+          </w:tcPr>
+          <w:p>
+            <w:r>
+              <w:rPr>
+                <w:sz w:val="17"/>
+                <w:rFonts w:ascii="Calibri" w:hAnsi="Calibri"/>
+              </w:rPr>
+              <w:t xml:space="preserve">параметризований запит EF Core, AsNoTracking(), явна проєкція</w:t>
             </w:r>
           </w:p>
         </w:tc>
@@ -2324,7 +2414,7 @@
       <w:tr>
         <w:tc>
           <w:tcPr>
-            <w:tcW w:w="1700" w:type="dxa"/>
+            <w:tcW w:w="1650" w:type="dxa"/>
           </w:tcPr>
           <w:p>
             <w:r>
@@ -2338,7 +2428,7 @@
         </w:tc>
         <w:tc>
           <w:tcPr>
-            <w:tcW w:w="1650" w:type="dxa"/>
+            <w:tcW w:w="1600" w:type="dxa"/>
           </w:tcPr>
           <w:p>
             <w:r>
@@ -2352,21 +2442,21 @@
         </w:tc>
         <w:tc>
           <w:tcPr>
-            <w:tcW w:w="2850" w:type="dxa"/>
-          </w:tcPr>
-          <w:p>
-            <w:r>
-              <w:rPr>
-                <w:sz w:val="17"/>
-                <w:rFonts w:ascii="Calibri" w:hAnsi="Calibri"/>
-              </w:rPr>
-              <w:t xml:space="preserve">право прочитати entity = право одержати всі поля</w:t>
-            </w:r>
-          </w:p>
-        </w:tc>
-        <w:tc>
-          <w:tcPr>
-            <w:tcW w:w="3200" w:type="dxa"/>
+            <w:tcW w:w="2900" w:type="dxa"/>
+          </w:tcPr>
+          <w:p>
+            <w:r>
+              <w:rPr>
+                <w:sz w:val="17"/>
+                <w:rFonts w:ascii="Calibri" w:hAnsi="Calibri"/>
+              </w:rPr>
+              <w:t xml:space="preserve">право прочитати запис = право бачити всі поля</w:t>
+            </w:r>
+          </w:p>
+        </w:tc>
+        <w:tc>
+          <w:tcPr>
+            <w:tcW w:w="3250" w:type="dxa"/>
           </w:tcPr>
           <w:p>
             <w:r>
@@ -2382,20 +2472,6 @@
       <w:tr>
         <w:tc>
           <w:tcPr>
-            <w:tcW w:w="1700" w:type="dxa"/>
-          </w:tcPr>
-          <w:p>
-            <w:r>
-              <w:rPr>
-                <w:sz w:val="17"/>
-                <w:rFonts w:ascii="Calibri" w:hAnsi="Calibri"/>
-              </w:rPr>
-              <w:t xml:space="preserve">дані response → DOM</w:t>
-            </w:r>
-          </w:p>
-        </w:tc>
-        <w:tc>
-          <w:tcPr>
             <w:tcW w:w="1650" w:type="dxa"/>
           </w:tcPr>
           <w:p>
@@ -2404,27 +2480,41 @@
                 <w:sz w:val="17"/>
                 <w:rFonts w:ascii="Calibri" w:hAnsi="Calibri"/>
               </w:rPr>
+              <w:t xml:space="preserve">response → DOM</w:t>
+            </w:r>
+          </w:p>
+        </w:tc>
+        <w:tc>
+          <w:tcPr>
+            <w:tcW w:w="1600" w:type="dxa"/>
+          </w:tcPr>
+          <w:p>
+            <w:r>
+              <w:rPr>
+                <w:sz w:val="17"/>
+                <w:rFonts w:ascii="Calibri" w:hAnsi="Calibri"/>
+              </w:rPr>
               <w:t xml:space="preserve">текстові значення з JSON</w:t>
             </w:r>
           </w:p>
         </w:tc>
         <w:tc>
           <w:tcPr>
-            <w:tcW w:w="2850" w:type="dxa"/>
-          </w:tcPr>
-          <w:p>
-            <w:r>
-              <w:rPr>
-                <w:sz w:val="17"/>
-                <w:rFonts w:ascii="Calibri" w:hAnsi="Calibri"/>
-              </w:rPr>
-              <w:t xml:space="preserve">текст можна інтерпретувати як HTML</w:t>
-            </w:r>
-          </w:p>
-        </w:tc>
-        <w:tc>
-          <w:tcPr>
-            <w:tcW w:w="3200" w:type="dxa"/>
+            <w:tcW w:w="2900" w:type="dxa"/>
+          </w:tcPr>
+          <w:p>
+            <w:r>
+              <w:rPr>
+                <w:sz w:val="17"/>
+                <w:rFonts w:ascii="Calibri" w:hAnsi="Calibri"/>
+              </w:rPr>
+              <w:t xml:space="preserve">текст можна вставити як HTML</w:t>
+            </w:r>
+          </w:p>
+        </w:tc>
+        <w:tc>
+          <w:tcPr>
+            <w:tcW w:w="3250" w:type="dxa"/>
           </w:tcPr>
           <w:p>
             <w:r>
@@ -2463,46 +2553,46 @@
           <w:sz w:val="21"/>
           <w:rFonts w:ascii="Calibri" w:hAnsi="Calibri"/>
         </w:rPr>
-        <w:t xml:space="preserve">•  Запис Network для успішного GET /api/incidents/{id}: method, фактичний URL, 200, application/json, JSON.</w:t>
-      </w:r>
-    </w:p>
-    <w:p>
-      <w:pPr>
-        <w:ind w:left="360" w:hanging="220"/>
-        <w:spacing w:after="30"/>
-      </w:pPr>
-      <w:r>
-        <w:rPr>
-          <w:sz w:val="21"/>
-          <w:rFonts w:ascii="Calibri" w:hAnsi="Calibri"/>
-        </w:rPr>
-        <w:t xml:space="preserve">•  Гілка відсутнього ресурсу для іншого UUID: 404, application/problem+json, фактичний traceId.</w:t>
-      </w:r>
-    </w:p>
-    <w:p>
-      <w:pPr>
-        <w:ind w:left="360" w:hanging="220"/>
-        <w:spacing w:after="30"/>
-      </w:pPr>
-      <w:r>
-        <w:rPr>
-          <w:sz w:val="21"/>
-          <w:rFonts w:ascii="Calibri" w:hAnsi="Calibri"/>
-        </w:rPr>
-        <w:t xml:space="preserve">•  Зв'язок request → IncidentEndpoints.GetDetailsAsync → IncidentQueries.GetDetailsAsync → SecureLabDbContext.Incidents → таблиця incidents (знайдено пошуком за назвою, без готових номерів рядків).</w:t>
-      </w:r>
-    </w:p>
-    <w:p>
-      <w:pPr>
-        <w:ind w:left="360" w:hanging="220"/>
-        <w:spacing w:after="30"/>
-      </w:pPr>
-      <w:r>
-        <w:rPr>
-          <w:sz w:val="21"/>
-          <w:rFonts w:ascii="Calibri" w:hAnsi="Calibri"/>
-        </w:rPr>
-        <w:t xml:space="preserve">•  Read-only SQL-звірка за id збігається з полями details response.</w:t>
+        <w:t xml:space="preserve">•  Запис Network для успішного GET /api/incidents/{id}: method, URL, 200, application/json, JSON.</w:t>
+      </w:r>
+    </w:p>
+    <w:p>
+      <w:pPr>
+        <w:ind w:left="360" w:hanging="220"/>
+        <w:spacing w:after="30"/>
+      </w:pPr>
+      <w:r>
+        <w:rPr>
+          <w:sz w:val="21"/>
+          <w:rFonts w:ascii="Calibri" w:hAnsi="Calibri"/>
+        </w:rPr>
+        <w:t xml:space="preserve">•  Гілка відсутнього ресурсу: 404, application/problem+json, traceId цього запуску.</w:t>
+      </w:r>
+    </w:p>
+    <w:p>
+      <w:pPr>
+        <w:ind w:left="360" w:hanging="220"/>
+        <w:spacing w:after="30"/>
+      </w:pPr>
+      <w:r>
+        <w:rPr>
+          <w:sz w:val="21"/>
+          <w:rFonts w:ascii="Calibri" w:hAnsi="Calibri"/>
+        </w:rPr>
+        <w:t xml:space="preserve">•  Зв'язок запиту з IncidentEndpoints.GetDetailsAsync → IncidentQueries.GetDetailsAsync → SecureLabDbContext.Incidents → таблиця incidents (знайдено пошуком за назвою в коді).</w:t>
+      </w:r>
+    </w:p>
+    <w:p>
+      <w:pPr>
+        <w:ind w:left="360" w:hanging="220"/>
+        <w:spacing w:after="30"/>
+      </w:pPr>
+      <w:r>
+        <w:rPr>
+          <w:sz w:val="21"/>
+          <w:rFonts w:ascii="Calibri" w:hAnsi="Calibri"/>
+        </w:rPr>
+        <w:t xml:space="preserve">•  Read-only SQL-звірка за id збігається з полями відповіді.</w:t>
       </w:r>
     </w:p>
     <w:p>
@@ -2528,7 +2618,7 @@
           <w:sz w:val="21"/>
           <w:rFonts w:ascii="Calibri" w:hAnsi="Calibri"/>
         </w:rPr>
-        <w:t xml:space="preserve">•  Заповнено таблицю з чотирьох меж довіри саме details-потоку.</w:t>
+        <w:t xml:space="preserve">•  Заповнено таблицю з чотирьох меж довіри.</w:t>
       </w:r>
     </w:p>
     <w:p>
@@ -2545,7 +2635,7 @@
           <w:rFonts w:ascii="Calibri" w:hAnsi="Calibri"/>
           <w:color w:val="1F3864"/>
         </w:rPr>
-        <w:t>Етап 3. Наскрізне розширення: підсумок інцидентів за severity</w:t>
+        <w:t>Етап 3. Наскрізне розширення: підсумок за severity</w:t>
       </w:r>
     </w:p>
     <w:p>
@@ -2576,13 +2666,13 @@
         </w:tblBorders>
       </w:tblPr>
       <w:tblGrid>
-        <w:gridCol w:w="2600"/>
-        <w:gridCol w:w="6800"/>
+        <w:gridCol w:w="2500"/>
+        <w:gridCol w:w="6900"/>
       </w:tblGrid>
       <w:tr>
         <w:tc>
           <w:tcPr>
-            <w:tcW w:w="2600" w:type="dxa"/>
+            <w:tcW w:w="2500" w:type="dxa"/>
             <w:shd w:val="clear" w:fill="1F3864"/>
           </w:tcPr>
           <w:p>
@@ -2599,7 +2689,7 @@
         </w:tc>
         <w:tc>
           <w:tcPr>
-            <w:tcW w:w="6800" w:type="dxa"/>
+            <w:tcW w:w="6900" w:type="dxa"/>
             <w:shd w:val="clear" w:fill="1F3864"/>
           </w:tcPr>
           <w:p>
@@ -2610,7 +2700,7 @@
                 <w:b/>
                 <w:color w:val="FFFFFF"/>
               </w:rPr>
-              <w:t xml:space="preserve">Контракт варіанта 2-A</w:t>
+              <w:t xml:space="preserve">Значення</w:t>
             </w:r>
           </w:p>
         </w:tc>
@@ -2618,21 +2708,21 @@
       <w:tr>
         <w:tc>
           <w:tcPr>
-            <w:tcW w:w="2600" w:type="dxa"/>
-          </w:tcPr>
-          <w:p>
-            <w:r>
-              <w:rPr>
-                <w:sz w:val="17"/>
-                <w:rFonts w:ascii="Calibri" w:hAnsi="Calibri"/>
-              </w:rPr>
-              <w:t xml:space="preserve">HTTP method / URL</w:t>
-            </w:r>
-          </w:p>
-        </w:tc>
-        <w:tc>
-          <w:tcPr>
-            <w:tcW w:w="6800" w:type="dxa"/>
+            <w:tcW w:w="2500" w:type="dxa"/>
+          </w:tcPr>
+          <w:p>
+            <w:r>
+              <w:rPr>
+                <w:sz w:val="17"/>
+                <w:rFonts w:ascii="Calibri" w:hAnsi="Calibri"/>
+              </w:rPr>
+              <w:t xml:space="preserve">Method / URL</w:t>
+            </w:r>
+          </w:p>
+        </w:tc>
+        <w:tc>
+          <w:tcPr>
+            <w:tcW w:w="6900" w:type="dxa"/>
           </w:tcPr>
           <w:p>
             <w:r>
@@ -2648,7 +2738,7 @@
       <w:tr>
         <w:tc>
           <w:tcPr>
-            <w:tcW w:w="2600" w:type="dxa"/>
+            <w:tcW w:w="2500" w:type="dxa"/>
           </w:tcPr>
           <w:p>
             <w:r>
@@ -2662,7 +2752,7 @@
         </w:tc>
         <w:tc>
           <w:tcPr>
-            <w:tcW w:w="6800" w:type="dxa"/>
+            <w:tcW w:w="6900" w:type="dxa"/>
           </w:tcPr>
           <w:p>
             <w:r>
@@ -2678,7 +2768,7 @@
       <w:tr>
         <w:tc>
           <w:tcPr>
-            <w:tcW w:w="2600" w:type="dxa"/>
+            <w:tcW w:w="2500" w:type="dxa"/>
           </w:tcPr>
           <w:p>
             <w:r>
@@ -2692,15 +2782,15 @@
         </w:tc>
         <w:tc>
           <w:tcPr>
-            <w:tcW w:w="6800" w:type="dxa"/>
-          </w:tcPr>
-          <w:p>
-            <w:r>
-              <w:rPr>
-                <w:sz w:val="17"/>
-                <w:rFonts w:ascii="Calibri" w:hAnsi="Calibri"/>
-              </w:rPr>
-              <w:t xml:space="preserve">200 OK, JSON-масив елементів підсумку</w:t>
+            <w:tcW w:w="6900" w:type="dxa"/>
+          </w:tcPr>
+          <w:p>
+            <w:r>
+              <w:rPr>
+                <w:sz w:val="17"/>
+                <w:rFonts w:ascii="Calibri" w:hAnsi="Calibri"/>
+              </w:rPr>
+              <w:t xml:space="preserve">200 OK, JSON-масив елементів { severity, count }</w:t>
             </w:r>
           </w:p>
         </w:tc>
@@ -2708,29 +2798,29 @@
       <w:tr>
         <w:tc>
           <w:tcPr>
-            <w:tcW w:w="2600" w:type="dxa"/>
-          </w:tcPr>
-          <w:p>
-            <w:r>
-              <w:rPr>
-                <w:sz w:val="17"/>
-                <w:rFonts w:ascii="Calibri" w:hAnsi="Calibri"/>
-              </w:rPr>
-              <w:t xml:space="preserve">Поля елемента</w:t>
-            </w:r>
-          </w:p>
-        </w:tc>
-        <w:tc>
-          <w:tcPr>
-            <w:tcW w:w="6800" w:type="dxa"/>
-          </w:tcPr>
-          <w:p>
-            <w:r>
-              <w:rPr>
-                <w:sz w:val="17"/>
-                <w:rFonts w:ascii="Calibri" w:hAnsi="Calibri"/>
-              </w:rPr>
-              <w:t xml:space="preserve">severity, count</w:t>
+            <w:tcW w:w="2500" w:type="dxa"/>
+          </w:tcPr>
+          <w:p>
+            <w:r>
+              <w:rPr>
+                <w:sz w:val="17"/>
+                <w:rFonts w:ascii="Calibri" w:hAnsi="Calibri"/>
+              </w:rPr>
+              <w:t xml:space="preserve">Заборонені зайві дані</w:t>
+            </w:r>
+          </w:p>
+        </w:tc>
+        <w:tc>
+          <w:tcPr>
+            <w:tcW w:w="6900" w:type="dxa"/>
+          </w:tcPr>
+          <w:p>
+            <w:r>
+              <w:rPr>
+                <w:sz w:val="17"/>
+                <w:rFonts w:ascii="Calibri" w:hAnsi="Calibri"/>
+              </w:rPr>
+              <w:t xml:space="preserve">description, owner ID, email, коментарі</w:t>
             </w:r>
           </w:p>
         </w:tc>
@@ -2738,29 +2828,29 @@
       <w:tr>
         <w:tc>
           <w:tcPr>
-            <w:tcW w:w="2600" w:type="dxa"/>
-          </w:tcPr>
-          <w:p>
-            <w:r>
-              <w:rPr>
-                <w:sz w:val="17"/>
-                <w:rFonts w:ascii="Calibri" w:hAnsi="Calibri"/>
-              </w:rPr>
-              <w:t xml:space="preserve">Заборонені зайві дані</w:t>
-            </w:r>
-          </w:p>
-        </w:tc>
-        <w:tc>
-          <w:tcPr>
-            <w:tcW w:w="6800" w:type="dxa"/>
-          </w:tcPr>
-          <w:p>
-            <w:r>
-              <w:rPr>
-                <w:sz w:val="17"/>
-                <w:rFonts w:ascii="Calibri" w:hAnsi="Calibri"/>
-              </w:rPr>
-              <w:t xml:space="preserve">description, owner ID, email, коментарі</w:t>
+            <w:tcW w:w="2500" w:type="dxa"/>
+          </w:tcPr>
+          <w:p>
+            <w:r>
+              <w:rPr>
+                <w:sz w:val="17"/>
+                <w:rFonts w:ascii="Calibri" w:hAnsi="Calibri"/>
+              </w:rPr>
+              <w:t xml:space="preserve">Рівень без інцидентів</w:t>
+            </w:r>
+          </w:p>
+        </w:tc>
+        <w:tc>
+          <w:tcPr>
+            <w:tcW w:w="6900" w:type="dxa"/>
+          </w:tcPr>
+          <w:p>
+            <w:r>
+              <w:rPr>
+                <w:sz w:val="17"/>
+                <w:rFonts w:ascii="Calibri" w:hAnsi="Calibri"/>
+              </w:rPr>
+              <w:t xml:space="preserve">показується з count: 0 (обрана політика — показувати всі рівні)</w:t>
             </w:r>
           </w:p>
         </w:tc>
@@ -2768,29 +2858,29 @@
       <w:tr>
         <w:tc>
           <w:tcPr>
-            <w:tcW w:w="2600" w:type="dxa"/>
-          </w:tcPr>
-          <w:p>
-            <w:r>
-              <w:rPr>
-                <w:sz w:val="17"/>
-                <w:rFonts w:ascii="Calibri" w:hAnsi="Calibri"/>
-              </w:rPr>
-              <w:t xml:space="preserve">Рівень без інцидентів</w:t>
-            </w:r>
-          </w:p>
-        </w:tc>
-        <w:tc>
-          <w:tcPr>
-            <w:tcW w:w="6800" w:type="dxa"/>
-          </w:tcPr>
-          <w:p>
-            <w:r>
-              <w:rPr>
-                <w:sz w:val="17"/>
-                <w:rFonts w:ascii="Calibri" w:hAnsi="Calibri"/>
-              </w:rPr>
-              <w:t xml:space="preserve">має count: 0 (обрана політика повного переліку рівнів)</w:t>
+            <w:tcW w:w="2500" w:type="dxa"/>
+          </w:tcPr>
+          <w:p>
+            <w:r>
+              <w:rPr>
+                <w:sz w:val="17"/>
+                <w:rFonts w:ascii="Calibri" w:hAnsi="Calibri"/>
+              </w:rPr>
+              <w:t xml:space="preserve">Порядок</w:t>
+            </w:r>
+          </w:p>
+        </w:tc>
+        <w:tc>
+          <w:tcPr>
+            <w:tcW w:w="6900" w:type="dxa"/>
+          </w:tcPr>
+          <w:p>
+            <w:r>
+              <w:rPr>
+                <w:sz w:val="17"/>
+                <w:rFonts w:ascii="Calibri" w:hAnsi="Calibri"/>
+              </w:rPr>
+              <w:t xml:space="preserve">сталий і задокументований — за критичністю: Low, Medium, High, Critical</w:t>
             </w:r>
           </w:p>
         </w:tc>
@@ -2798,37 +2888,7 @@
       <w:tr>
         <w:tc>
           <w:tcPr>
-            <w:tcW w:w="2600" w:type="dxa"/>
-          </w:tcPr>
-          <w:p>
-            <w:r>
-              <w:rPr>
-                <w:sz w:val="17"/>
-                <w:rFonts w:ascii="Calibri" w:hAnsi="Calibri"/>
-              </w:rPr>
-              <w:t xml:space="preserve">Порядок</w:t>
-            </w:r>
-          </w:p>
-        </w:tc>
-        <w:tc>
-          <w:tcPr>
-            <w:tcW w:w="6800" w:type="dxa"/>
-          </w:tcPr>
-          <w:p>
-            <w:r>
-              <w:rPr>
-                <w:sz w:val="17"/>
-                <w:rFonts w:ascii="Calibri" w:hAnsi="Calibri"/>
-              </w:rPr>
-              <w:t xml:space="preserve">явний, сталий, задокументований — порядок критичності Low, Medium, High, Critical</w:t>
-            </w:r>
-          </w:p>
-        </w:tc>
-      </w:tr>
-      <w:tr>
-        <w:tc>
-          <w:tcPr>
-            <w:tcW w:w="2600" w:type="dxa"/>
+            <w:tcW w:w="2500" w:type="dxa"/>
           </w:tcPr>
           <w:p>
             <w:r>
@@ -2842,15 +2902,15 @@
         </w:tc>
         <w:tc>
           <w:tcPr>
-            <w:tcW w:w="6800" w:type="dxa"/>
-          </w:tcPr>
-          <w:p>
-            <w:r>
-              <w:rPr>
-                <w:sz w:val="17"/>
-                <w:rFonts w:ascii="Calibri" w:hAnsi="Calibri"/>
-              </w:rPr>
-              <w:t xml:space="preserve">перевіряється за явним allowlist; невідоме значення → 400 Validation Problem Details</w:t>
+            <w:tcW w:w="6900" w:type="dxa"/>
+          </w:tcPr>
+          <w:p>
+            <w:r>
+              <w:rPr>
+                <w:sz w:val="17"/>
+                <w:rFonts w:ascii="Calibri" w:hAnsi="Calibri"/>
+              </w:rPr>
+              <w:t xml:space="preserve">перевіряється за списком дозволених значень; невідоме → 400</w:t>
             </w:r>
           </w:p>
         </w:tc>
@@ -2863,7 +2923,7 @@
           <w:sz w:val="21"/>
           <w:rFonts w:ascii="Calibri" w:hAnsi="Calibri"/>
         </w:rPr>
-        <w:t xml:space="preserve">Обрана політика нульових груп — повний перелік рівнів: після агрегації в БД відсутні значення enum доповнюються елементами з count: 0. Міграція і зміна entity не потрібні (Incident.Severity та seed уже існують).</w:t>
+        <w:t xml:space="preserve">Обрана політика нульових груп — «повний перелік рівнів»: спершу беру агрегат із БД, потім додаю відсутні рівні зі значенням 0. Причина вибору: так відповідь стабільна незалежно від того, які рівні зараз є в базі. Міграція і зміна entity не потрібні — поле Severity і seed уже існують.</w:t>
       </w:r>
     </w:p>
     <w:p>
@@ -2877,7 +2937,7 @@
           <w:rFonts w:ascii="Calibri" w:hAnsi="Calibri"/>
           <w:color w:val="2E4A6B"/>
         </w:rPr>
-        <w:t>2. Реалізація query (окремий метод + окремий response DTO)</w:t>
+        <w:t>2. Реалізація запиту (окремий метод + окремий response DTO)</w:t>
       </w:r>
     </w:p>
     <w:p>
@@ -2887,7 +2947,7 @@
           <w:sz w:val="21"/>
           <w:rFonts w:ascii="Calibri" w:hAnsi="Calibri"/>
         </w:rPr>
-        <w:t xml:space="preserve">src/SecureLab.Api/Presentation/Contracts/IncidentResponses.cs:</w:t>
+        <w:t xml:space="preserve">Окремий DTO (src/SecureLab.Api/Presentation/Contracts/IncidentResponses.cs):</w:t>
       </w:r>
     </w:p>
     <w:p>
@@ -2911,7 +2971,7 @@
           <w:sz w:val="21"/>
           <w:rFonts w:ascii="Calibri" w:hAnsi="Calibri"/>
         </w:rPr>
-        <w:t xml:space="preserve">src/SecureLab.Api/Application/Incidents/IncidentQueries.cs:</w:t>
+        <w:t xml:space="preserve">Метод у src/SecureLab.Api/Application/Incidents/IncidentQueries.cs:</w:t>
       </w:r>
     </w:p>
     <w:p>
@@ -3015,7 +3075,7 @@
           <w:rFonts w:ascii="Consolas" w:hAnsi="Consolas"/>
           <w:sz w:val="16"/>
         </w:rPr>
-        <w:t xml:space="preserve">    var aggregated = await query</w:t>
+        <w:t xml:space="preserve">    // 1) агрегат із БД: GroupBy повертає лише наявні рівні</w:t>
       </w:r>
     </w:p>
     <w:p>
@@ -3028,7 +3088,7 @@
           <w:rFonts w:ascii="Consolas" w:hAnsi="Consolas"/>
           <w:sz w:val="16"/>
         </w:rPr>
-        <w:t xml:space="preserve">        .GroupBy(incident =&gt; incident.Severity)</w:t>
+        <w:t xml:space="preserve">    var aggregated = await query</w:t>
       </w:r>
     </w:p>
     <w:p>
@@ -3041,7 +3101,7 @@
           <w:rFonts w:ascii="Consolas" w:hAnsi="Consolas"/>
           <w:sz w:val="16"/>
         </w:rPr>
-        <w:t xml:space="preserve">        .Select(g =&gt; new { Severity = g.Key, Count = g.Count() })</w:t>
+        <w:t xml:space="preserve">        .GroupBy(incident =&gt; incident.Severity)</w:t>
       </w:r>
     </w:p>
     <w:p>
@@ -3054,7 +3114,7 @@
           <w:rFonts w:ascii="Consolas" w:hAnsi="Consolas"/>
           <w:sz w:val="16"/>
         </w:rPr>
-        <w:t xml:space="preserve">        .ToListAsync(cancellationToken);</w:t>
+        <w:t xml:space="preserve">        .Select(g =&gt; new { Severity = g.Key, Count = g.Count() })</w:t>
       </w:r>
     </w:p>
     <w:p>
@@ -3067,7 +3127,7 @@
           <w:rFonts w:ascii="Consolas" w:hAnsi="Consolas"/>
           <w:sz w:val="16"/>
         </w:rPr>
-        <w:t xml:space="preserve">    var counts = aggregated.ToDictionary(i =&gt; i.Severity, i =&gt; i.Count);</w:t>
+        <w:t xml:space="preserve">        .ToListAsync(cancellationToken);</w:t>
       </w:r>
     </w:p>
     <w:p>
@@ -3080,7 +3140,7 @@
           <w:rFonts w:ascii="Consolas" w:hAnsi="Consolas"/>
           <w:sz w:val="16"/>
         </w:rPr>
-        <w:t xml:space="preserve"> </w:t>
+        <w:t xml:space="preserve">    var counts = aggregated.ToDictionary(x =&gt; x.Severity, x =&gt; x.Count);</w:t>
       </w:r>
     </w:p>
     <w:p>
@@ -3093,7 +3153,7 @@
           <w:rFonts w:ascii="Consolas" w:hAnsi="Consolas"/>
           <w:sz w:val="16"/>
         </w:rPr>
-        <w:t xml:space="preserve">    var summary = SeverityOrder   // [Low, Medium, High, Critical]</w:t>
+        <w:t xml:space="preserve"> </w:t>
       </w:r>
     </w:p>
     <w:p>
@@ -3106,7 +3166,7 @@
           <w:rFonts w:ascii="Consolas" w:hAnsi="Consolas"/>
           <w:sz w:val="16"/>
         </w:rPr>
-        <w:t xml:space="preserve">        .Select(s =&gt; new IncidentSeveritySummaryResponse(</w:t>
+        <w:t xml:space="preserve">    // 2) доповнюю відсутні рівні нулями і впорядковую за критичністю</w:t>
       </w:r>
     </w:p>
     <w:p>
@@ -3119,7 +3179,7 @@
           <w:rFonts w:ascii="Consolas" w:hAnsi="Consolas"/>
           <w:sz w:val="16"/>
         </w:rPr>
-        <w:t xml:space="preserve">            s.ToString(), counts.TryGetValue(s, out var c) ? c : 0))</w:t>
+        <w:t xml:space="preserve">    var summary = SeverityOrder   // Low, Medium, High, Critical</w:t>
       </w:r>
     </w:p>
     <w:p>
@@ -3132,7 +3192,7 @@
           <w:rFonts w:ascii="Consolas" w:hAnsi="Consolas"/>
           <w:sz w:val="16"/>
         </w:rPr>
-        <w:t xml:space="preserve">        .ToList();</w:t>
+        <w:t xml:space="preserve">        .Select(s =&gt; new IncidentSeveritySummaryResponse(</w:t>
       </w:r>
     </w:p>
     <w:p>
@@ -3145,7 +3205,7 @@
           <w:rFonts w:ascii="Consolas" w:hAnsi="Consolas"/>
           <w:sz w:val="16"/>
         </w:rPr>
-        <w:t xml:space="preserve">    logger.LogInformation("Сформовано підсумок за severity: {GroupCount} рівнів, " +</w:t>
+        <w:t xml:space="preserve">            s.ToString(), counts.TryGetValue(s, out var c) ? c : 0))</w:t>
       </w:r>
     </w:p>
     <w:p>
@@ -3158,7 +3218,7 @@
           <w:rFonts w:ascii="Consolas" w:hAnsi="Consolas"/>
           <w:sz w:val="16"/>
         </w:rPr>
-        <w:t xml:space="preserve">        "фільтр {StatusFilter}, груп у БД {NonEmptyGroups}",</w:t>
+        <w:t xml:space="preserve">        .ToList();</w:t>
       </w:r>
     </w:p>
     <w:p>
@@ -3171,7 +3231,7 @@
           <w:rFonts w:ascii="Consolas" w:hAnsi="Consolas"/>
           <w:sz w:val="16"/>
         </w:rPr>
-        <w:t xml:space="preserve">        summary.Count, status?.ToString() ?? "усі", aggregated.Count);</w:t>
+        <w:t xml:space="preserve"> </w:t>
       </w:r>
     </w:p>
     <w:p>
@@ -3184,7 +3244,7 @@
           <w:rFonts w:ascii="Consolas" w:hAnsi="Consolas"/>
           <w:sz w:val="16"/>
         </w:rPr>
-        <w:t xml:space="preserve">    return summary;</w:t>
+        <w:t xml:space="preserve">    logger.LogInformation("Сформовано підсумок за severity: {GroupCount} рівнів, " +</w:t>
       </w:r>
     </w:p>
     <w:p>
@@ -3197,6 +3257,45 @@
           <w:rFonts w:ascii="Consolas" w:hAnsi="Consolas"/>
           <w:sz w:val="16"/>
         </w:rPr>
+        <w:t xml:space="preserve">        "фільтр {StatusFilter}, груп у БД {NonEmptyGroups}",</w:t>
+      </w:r>
+    </w:p>
+    <w:p>
+      <w:pPr>
+        <w:shd w:val="clear" w:fill="F2F2F2"/>
+        <w:spacing w:before="0" w:after="0"/>
+      </w:pPr>
+      <w:r>
+        <w:rPr>
+          <w:rFonts w:ascii="Consolas" w:hAnsi="Consolas"/>
+          <w:sz w:val="16"/>
+        </w:rPr>
+        <w:t xml:space="preserve">        summary.Count, status?.ToString() ?? "усі", aggregated.Count);</w:t>
+      </w:r>
+    </w:p>
+    <w:p>
+      <w:pPr>
+        <w:shd w:val="clear" w:fill="F2F2F2"/>
+        <w:spacing w:before="0" w:after="0"/>
+      </w:pPr>
+      <w:r>
+        <w:rPr>
+          <w:rFonts w:ascii="Consolas" w:hAnsi="Consolas"/>
+          <w:sz w:val="16"/>
+        </w:rPr>
+        <w:t xml:space="preserve">    return summary;</w:t>
+      </w:r>
+    </w:p>
+    <w:p>
+      <w:pPr>
+        <w:shd w:val="clear" w:fill="F2F2F2"/>
+        <w:spacing w:before="0" w:after="0"/>
+      </w:pPr>
+      <w:r>
+        <w:rPr>
+          <w:rFonts w:ascii="Consolas" w:hAnsi="Consolas"/>
+          <w:sz w:val="16"/>
+        </w:rPr>
         <w:t xml:space="preserve">}</w:t>
       </w:r>
     </w:p>
@@ -3211,33 +3310,33 @@
           <w:sz w:val="21"/>
           <w:rFonts w:ascii="Calibri" w:hAnsi="Calibri"/>
         </w:rPr>
-        <w:t xml:space="preserve">•  Результат query містить лише severity і count, не повертає Incident і не формує JSON рядком.</w:t>
-      </w:r>
-    </w:p>
-    <w:p>
-      <w:pPr>
-        <w:ind w:left="360" w:hanging="220"/>
-        <w:spacing w:after="30"/>
-      </w:pPr>
-      <w:r>
-        <w:rPr>
-          <w:sz w:val="21"/>
-          <w:rFonts w:ascii="Calibri" w:hAnsi="Calibri"/>
-        </w:rPr>
-        <w:t xml:space="preserve">•  Не використано .Result / .Wait(); виконання через ToListAsync(cancellationToken).</w:t>
-      </w:r>
-    </w:p>
-    <w:p>
-      <w:pPr>
-        <w:ind w:left="360" w:hanging="220"/>
-        <w:spacing w:after="30"/>
-      </w:pPr>
-      <w:r>
-        <w:rPr>
-          <w:sz w:val="21"/>
-          <w:rFonts w:ascii="Calibri" w:hAnsi="Calibri"/>
-        </w:rPr>
-        <w:t xml:space="preserve">•  Для повного переліку рівнів агрегат спершу матеріалізовано з БД, потім доповнено значеннями enum.</w:t>
+        <w:t xml:space="preserve">•  Запит повертає лише severity і count — не сам Incident, і JSON не збирається рядком.</w:t>
+      </w:r>
+    </w:p>
+    <w:p>
+      <w:pPr>
+        <w:ind w:left="360" w:hanging="220"/>
+        <w:spacing w:after="30"/>
+      </w:pPr>
+      <w:r>
+        <w:rPr>
+          <w:sz w:val="21"/>
+          <w:rFonts w:ascii="Calibri" w:hAnsi="Calibri"/>
+        </w:rPr>
+        <w:t xml:space="preserve">•  Немає .Result / .Wait() — виконання асинхронне через ToListAsync(cancellationToken).</w:t>
+      </w:r>
+    </w:p>
+    <w:p>
+      <w:pPr>
+        <w:ind w:left="360" w:hanging="220"/>
+        <w:spacing w:after="30"/>
+      </w:pPr>
+      <w:r>
+        <w:rPr>
+          <w:sz w:val="21"/>
+          <w:rFonts w:ascii="Calibri" w:hAnsi="Calibri"/>
+        </w:rPr>
+        <w:t xml:space="preserve">•  Порядок задає явний масив SeverityOrder, а не сортування в SQL (у SQL Severity — це текст, тому сортування було б лексичним: High, Low, Medium).</w:t>
       </w:r>
     </w:p>
     <w:p>
@@ -3264,33 +3363,33 @@
           <w:sz w:val="21"/>
           <w:rFonts w:ascii="Calibri" w:hAnsi="Calibri"/>
         </w:rPr>
-        <w:t xml:space="preserve">•  У src/SecureLab.Api/Presentation/Endpoints/IncidentEndpoints.cs заготовку 501 замінено окремим асинхронним методом: одержує IncidentQueries через DI, приймає CancellationToken, викликає новий query, повертає Results.Ok(...).</w:t>
-      </w:r>
-    </w:p>
-    <w:p>
-      <w:pPr>
-        <w:ind w:left="360" w:hanging="220"/>
-        <w:spacing w:after="30"/>
-      </w:pPr>
-      <w:r>
-        <w:rPr>
-          <w:sz w:val="21"/>
-          <w:rFonts w:ascii="Calibri" w:hAnsi="Calibri"/>
-        </w:rPr>
-        <w:t xml:space="preserve">•  Прибрано metadata .ProducesProblem(StatusCodes.Status501NotImplemented); додано .Produces&lt;IReadOnlyList&lt;IncidentSeveritySummaryResponse&gt;&gt;() і .ProducesValidationProblem().</w:t>
-      </w:r>
-    </w:p>
-    <w:p>
-      <w:pPr>
-        <w:ind w:left="360" w:hanging="220"/>
-        <w:spacing w:after="30"/>
-      </w:pPr>
-      <w:r>
-        <w:rPr>
-          <w:sz w:val="21"/>
-          <w:rFonts w:ascii="Calibri" w:hAnsi="Calibri"/>
-        </w:rPr>
-        <w:t xml:space="preserve">•  Необов'язковий ?status= перевіряється за явним allowlist підтримуваних значень; некоректне → 400 Validation Problem Details. Program.cs уже реєструє IncidentQueries як scoped.</w:t>
+        <w:t xml:space="preserve">•  У IncidentEndpoints.cs заготовку, що повертала 501, замінив на окремий асинхронний метод: він одержує IncidentQueries через впровадження залежностей (DI), приймає CancellationToken, викликає новий запит і повертає Results.Ok(...).</w:t>
+      </w:r>
+    </w:p>
+    <w:p>
+      <w:pPr>
+        <w:ind w:left="360" w:hanging="220"/>
+        <w:spacing w:after="30"/>
+      </w:pPr>
+      <w:r>
+        <w:rPr>
+          <w:sz w:val="21"/>
+          <w:rFonts w:ascii="Calibri" w:hAnsi="Calibri"/>
+        </w:rPr>
+        <w:t xml:space="preserve">•  Прибрав metadata .ProducesProblem(501); додав .Produces&lt;IReadOnlyList&lt;IncidentSeveritySummaryResponse&gt;&gt;() і .ProducesValidationProblem().</w:t>
+      </w:r>
+    </w:p>
+    <w:p>
+      <w:pPr>
+        <w:ind w:left="360" w:hanging="220"/>
+        <w:spacing w:after="30"/>
+      </w:pPr>
+      <w:r>
+        <w:rPr>
+          <w:sz w:val="21"/>
+          <w:rFonts w:ascii="Calibri" w:hAnsi="Calibri"/>
+        </w:rPr>
+        <w:t xml:space="preserve">•  Необов'язковий ?status= перевіряю за явним списком дозволених значень (allowlist). Невідоме значення → 400 Validation Problem Details. IncidentQueries вже зареєстровано як scoped у Program.cs.</w:t>
       </w:r>
     </w:p>
     <w:p>
@@ -3300,7 +3399,7 @@
           <w:sz w:val="21"/>
           <w:rFonts w:ascii="Calibri" w:hAnsi="Calibri"/>
         </w:rPr>
-        <w:t xml:space="preserve">Доказ «до» — стартовий стан (тег starter-v0.1.0), збережено перед редагуванням коду:</w:t>
+        <w:t xml:space="preserve">Було (baseline, тег starter-v0.1.0, збережено до редагування коду):</w:t>
       </w:r>
     </w:p>
     <w:p>
@@ -3321,7 +3420,7 @@
                     <pic:cNvPicPr/>
                   </pic:nvPicPr>
                   <pic:blipFill>
-                    <a:blip xmlns:r="http://schemas.openxmlformats.org/officeDocument/2006/relationships" r:embed="Rc12b73a24f9b4bf5"/>
+                    <a:blip xmlns:r="http://schemas.openxmlformats.org/officeDocument/2006/relationships" r:embed="R5147beeb7505463e"/>
                     <a:stretch>
                       <a:fillRect/>
                     </a:stretch>
@@ -3354,7 +3453,7 @@
           <w:rFonts w:ascii="Calibri" w:hAnsi="Calibri"/>
           <w:color w:val="555555"/>
         </w:rPr>
-        <w:t xml:space="preserve">GET /api/incidents/severity-summary -&gt; 501 Not Implemented, application/problem+json (baseline).</w:t>
+        <w:t xml:space="preserve">GET /api/incidents/severity-summary → 501 Not Implemented, application/problem+json.</w:t>
       </w:r>
     </w:p>
     <w:p>
@@ -3364,7 +3463,7 @@
           <w:sz w:val="21"/>
           <w:rFonts w:ascii="Calibri" w:hAnsi="Calibri"/>
         </w:rPr>
-        <w:t xml:space="preserve">Доказ «після» — гілка lab/1-system:</w:t>
+        <w:t xml:space="preserve">Стало (гілка lab/1-system):</w:t>
       </w:r>
     </w:p>
     <w:p>
@@ -3385,7 +3484,7 @@
                     <pic:cNvPicPr/>
                   </pic:nvPicPr>
                   <pic:blipFill>
-                    <a:blip xmlns:r="http://schemas.openxmlformats.org/officeDocument/2006/relationships" r:embed="R183c4ccb4f7a4a62"/>
+                    <a:blip xmlns:r="http://schemas.openxmlformats.org/officeDocument/2006/relationships" r:embed="R0ef81d9fa9424bf4"/>
                     <a:stretch>
                       <a:fillRect/>
                     </a:stretch>
@@ -3418,7 +3517,7 @@
           <w:rFonts w:ascii="Calibri" w:hAnsi="Calibri"/>
           <w:color w:val="555555"/>
         </w:rPr>
-        <w:t xml:space="preserve">Без фільтра: [Low:1, Medium:1, High:1, Critical:0]. З ?status=New: [Low:1, Medium:0, High:1, Critical:0]. Повний перелік рівнів, порядок критичності.</w:t>
+        <w:t xml:space="preserve">Без фільтра: Low 1, Medium 1, High 1, Critical 0. З ?status=New: Low 1, Medium 0, High 1, Critical 0. Усі рівні, порядок за критичністю.</w:t>
       </w:r>
     </w:p>
     <w:p>
@@ -3439,7 +3538,7 @@
                     <pic:cNvPicPr/>
                   </pic:nvPicPr>
                   <pic:blipFill>
-                    <a:blip xmlns:r="http://schemas.openxmlformats.org/officeDocument/2006/relationships" r:embed="R67742c990f2649a8"/>
+                    <a:blip xmlns:r="http://schemas.openxmlformats.org/officeDocument/2006/relationships" r:embed="Rc7c824e0392044f6"/>
                     <a:stretch>
                       <a:fillRect/>
                     </a:stretch>
@@ -3472,7 +3571,7 @@
           <w:rFonts w:ascii="Calibri" w:hAnsi="Calibri"/>
           <w:color w:val="555555"/>
         </w:rPr>
-        <w:t xml:space="preserve">?status=Bogus -&gt; 400 Validation Problem Details: значення фільтра перевіряє сервер за allowlist, а не лише елемент &lt;select&gt; клієнта.</w:t>
+        <w:t xml:space="preserve">?status=Bogus → 400 Validation Problem Details: значення фільтра перевіряє сервер, а не лише елемент &lt;select&gt;.</w:t>
       </w:r>
     </w:p>
     <w:p>
@@ -3486,46 +3585,46 @@
           <w:rFonts w:ascii="Calibri" w:hAnsi="Calibri"/>
           <w:color w:val="2E4A6B"/>
         </w:rPr>
-        <w:t>4. Керований елемент у browser client</w:t>
-      </w:r>
-    </w:p>
-    <w:p>
-      <w:pPr>
-        <w:ind w:left="360" w:hanging="220"/>
-        <w:spacing w:after="30"/>
-      </w:pPr>
-      <w:r>
-        <w:rPr>
-          <w:sz w:val="21"/>
-          <w:rFonts w:ascii="Calibri" w:hAnsi="Calibri"/>
-        </w:rPr>
-        <w:t xml:space="preserve">•  Client/index.html: додано семантично названі кнопку #load-severity-summary, статус #severity-summary-status і контейнер результату &lt;ul id="severity-summary-list"&gt;.</w:t>
-      </w:r>
-    </w:p>
-    <w:p>
-      <w:pPr>
-        <w:ind w:left="360" w:hanging="220"/>
-        <w:spacing w:after="30"/>
-      </w:pPr>
-      <w:r>
-        <w:rPr>
-          <w:sz w:val="21"/>
-          <w:rFonts w:ascii="Calibri" w:hAnsi="Calibri"/>
-        </w:rPr>
-        <w:t xml:space="preserve">•  Client/app.js: окрема async-функція loadSeveritySummary(): до запиту показує «Завантаження…»; викликає apiFetch("/api/incidents/severity-summary"); для порожнього масиву — стан «Даних немає»; для успіху створює DOM-вузол кожного елемента й записує текст через li.textContent = `${severity}: ${count}`; у catch — коротке фіксоване повідомлення без stack trace; викликається обробником події кнопки.</w:t>
-      </w:r>
-    </w:p>
-    <w:p>
-      <w:pPr>
-        <w:ind w:left="360" w:hanging="220"/>
-        <w:spacing w:after="30"/>
-      </w:pPr>
-      <w:r>
-        <w:rPr>
-          <w:sz w:val="21"/>
-          <w:rFonts w:ascii="Calibri" w:hAnsi="Calibri"/>
-        </w:rPr>
-        <w:t xml:space="preserve">•  Дані API не перетворюються на HTML-розмітку; автоматизований тест клієнта вимагає textContent і забороняє небезпечні DOM sink.</w:t>
+        <w:t>4. Керований елемент у клієнті</w:t>
+      </w:r>
+    </w:p>
+    <w:p>
+      <w:pPr>
+        <w:ind w:left="360" w:hanging="220"/>
+        <w:spacing w:after="30"/>
+      </w:pPr>
+      <w:r>
+        <w:rPr>
+          <w:sz w:val="21"/>
+          <w:rFonts w:ascii="Calibri" w:hAnsi="Calibri"/>
+        </w:rPr>
+        <w:t xml:space="preserve">•  У Client/index.html додав кнопку #load-severity-summary, поле статусу і список &lt;ul id="severity-summary-list"&gt;.</w:t>
+      </w:r>
+    </w:p>
+    <w:p>
+      <w:pPr>
+        <w:ind w:left="360" w:hanging="220"/>
+        <w:spacing w:after="30"/>
+      </w:pPr>
+      <w:r>
+        <w:rPr>
+          <w:sz w:val="21"/>
+          <w:rFonts w:ascii="Calibri" w:hAnsi="Calibri"/>
+        </w:rPr>
+        <w:t xml:space="preserve">•  У Client/app.js — окрема async-функція loadSeveritySummary(): спершу показує «Завантаження…»; викликає apiFetch("/api/incidents/severity-summary"); для порожньої відповіді показує «Даних немає»; для успіху створює вузол на кожен елемент і пише текст через li.textContent = `${severity}: ${count}`; у catch — коротке повідомлення без деталей помилки. Викликається обробником кліку на кнопці.</w:t>
+      </w:r>
+    </w:p>
+    <w:p>
+      <w:pPr>
+        <w:ind w:left="360" w:hanging="220"/>
+        <w:spacing w:after="30"/>
+      </w:pPr>
+      <w:r>
+        <w:rPr>
+          <w:sz w:val="21"/>
+          <w:rFonts w:ascii="Calibri" w:hAnsi="Calibri"/>
+        </w:rPr>
+        <w:t xml:space="preserve">•  Дані з API не перетворюються на HTML. Автоматичний тест клієнта вимагає саме textContent і падає на небезпечних способах вставки (innerHTML тощо).</w:t>
       </w:r>
     </w:p>
     <w:p>
@@ -3546,7 +3645,7 @@
                     <pic:cNvPicPr/>
                   </pic:nvPicPr>
                   <pic:blipFill>
-                    <a:blip xmlns:r="http://schemas.openxmlformats.org/officeDocument/2006/relationships" r:embed="R7f95f97f6b7c4e5f"/>
+                    <a:blip xmlns:r="http://schemas.openxmlformats.org/officeDocument/2006/relationships" r:embed="Re30503aa1be54dd7"/>
                     <a:stretch>
                       <a:fillRect/>
                     </a:stretch>
@@ -3602,7 +3701,7 @@
           <w:sz w:val="21"/>
           <w:rFonts w:ascii="Calibri" w:hAnsi="Calibri"/>
         </w:rPr>
-        <w:t xml:space="preserve">До нового query додано структурований log результату операції — шаблон повідомлення окремо від значень параметрів (кількість рівнів, фільтр статусу, кількість непорожніх груп у БД). Фактичний запис для ?status=New:</w:t>
+        <w:t xml:space="preserve">У новий запит додав структурований лог: шаблон повідомлення окремо від значень (кількість рівнів, фільтр статусу, кількість непорожніх груп у БД). Фактичний запис для ?status=New:</w:t>
       </w:r>
     </w:p>
     <w:p>
@@ -3638,7 +3737,7 @@
           <w:sz w:val="21"/>
           <w:rFonts w:ascii="Calibri" w:hAnsi="Calibri"/>
         </w:rPr>
-        <w:t xml:space="preserve">Описи інцидентів, connection string, cookies і токени до журналу не потрапляють.</w:t>
+        <w:t xml:space="preserve">Описи інцидентів, рядок підключення, cookies і токени в лог не потрапляють.</w:t>
       </w:r>
     </w:p>
     <w:p>
@@ -3652,59 +3751,59 @@
           <w:rFonts w:ascii="Calibri" w:hAnsi="Calibri"/>
           <w:color w:val="2E4A6B"/>
         </w:rPr>
-        <w:t>6. Оновлення сценарію та перевірка розширення</w:t>
-      </w:r>
-    </w:p>
-    <w:p>
-      <w:pPr>
-        <w:ind w:left="360" w:hanging="220"/>
-        <w:spacing w:after="30"/>
-      </w:pPr>
-      <w:r>
-        <w:rPr>
-          <w:sz w:val="21"/>
-          <w:rFonts w:ascii="Calibri" w:hAnsi="Calibri"/>
-        </w:rPr>
-        <w:t xml:space="preserve">•  tests/http/incidents.http: коментар для точки розширення оновлено з очікування 501 на 200; сценарій виконано.</w:t>
-      </w:r>
-    </w:p>
-    <w:p>
-      <w:pPr>
-        <w:ind w:left="360" w:hanging="220"/>
-        <w:spacing w:after="30"/>
-      </w:pPr>
-      <w:r>
-        <w:rPr>
-          <w:sz w:val="21"/>
-          <w:rFonts w:ascii="Calibri" w:hAnsi="Calibri"/>
-        </w:rPr>
-        <w:t xml:space="preserve">•  Додано 4 інтеграційні тести severity-summary (status code, мінімальні поля контракту, порядок, повний перелік з Critical = 0, 400 для некоректного ?status=), без порівняння крихкого повного JSON-рядка.</w:t>
-      </w:r>
-    </w:p>
-    <w:p>
-      <w:pPr>
-        <w:ind w:left="360" w:hanging="220"/>
-        <w:spacing w:after="30"/>
-      </w:pPr>
-      <w:r>
-        <w:rPr>
-          <w:sz w:val="21"/>
-          <w:rFonts w:ascii="Calibri" w:hAnsi="Calibri"/>
-        </w:rPr>
-        <w:t xml:space="preserve">•  У DevTools Network перевірено: кнопка клієнта створює GET /api/incidents/severity-summary, response відповідає DTO, DOM безпечно показує результат.</w:t>
-      </w:r>
-    </w:p>
-    <w:p>
-      <w:pPr>
-        <w:ind w:left="360" w:hanging="220"/>
-        <w:spacing w:after="30"/>
-      </w:pPr>
-      <w:r>
-        <w:rPr>
-          <w:sz w:val="21"/>
-          <w:rFonts w:ascii="Calibri" w:hAnsi="Calibri"/>
-        </w:rPr>
-        <w:t xml:space="preserve">•  Порожній і некоректний HTTP-сценарії покрито готовим list-flow: ?status=Resolved → 200 з [], ?status=Unknown → 400. Разом з успішним summary та 404 для details — щонайменше чотири HTTP-сценарії.</w:t>
+        <w:t>6. Оновлення сценарію та перевірка</w:t>
+      </w:r>
+    </w:p>
+    <w:p>
+      <w:pPr>
+        <w:ind w:left="360" w:hanging="220"/>
+        <w:spacing w:after="30"/>
+      </w:pPr>
+      <w:r>
+        <w:rPr>
+          <w:sz w:val="21"/>
+          <w:rFonts w:ascii="Calibri" w:hAnsi="Calibri"/>
+        </w:rPr>
+        <w:t xml:space="preserve">•  У tests/http/incidents.http коментар для severity-summary оновлено з очікування 501 на 200; сценарій виконано.</w:t>
+      </w:r>
+    </w:p>
+    <w:p>
+      <w:pPr>
+        <w:ind w:left="360" w:hanging="220"/>
+        <w:spacing w:after="30"/>
+      </w:pPr>
+      <w:r>
+        <w:rPr>
+          <w:sz w:val="21"/>
+          <w:rFonts w:ascii="Calibri" w:hAnsi="Calibri"/>
+        </w:rPr>
+        <w:t xml:space="preserve">•  Додав 4 інтеграційні тести на severity-summary: status code; мінімальні поля контракту; порядок і лічильники за baseline seed (Critical = 0); 400 для некоректного ?status=. Без порівняння повного крихкого JSON-рядка.</w:t>
+      </w:r>
+    </w:p>
+    <w:p>
+      <w:pPr>
+        <w:ind w:left="360" w:hanging="220"/>
+        <w:spacing w:after="30"/>
+      </w:pPr>
+      <w:r>
+        <w:rPr>
+          <w:sz w:val="21"/>
+          <w:rFonts w:ascii="Calibri" w:hAnsi="Calibri"/>
+        </w:rPr>
+        <w:t xml:space="preserve">•  У Network перевірив: кнопка клієнта створює GET /api/incidents/severity-summary, відповідь відповідає DTO, DOM показує результат безпечно.</w:t>
+      </w:r>
+    </w:p>
+    <w:p>
+      <w:pPr>
+        <w:ind w:left="360" w:hanging="220"/>
+        <w:spacing w:after="30"/>
+      </w:pPr>
+      <w:r>
+        <w:rPr>
+          <w:sz w:val="21"/>
+          <w:rFonts w:ascii="Calibri" w:hAnsi="Calibri"/>
+        </w:rPr>
+        <w:t xml:space="preserve">•  Порожній і некоректний HTTP-сценарії покрито готовим фільтром списку: ?status=Resolved → 200 з [], ?status=Unknown → 400. Разом з успішним summary та 404 для details — щонайменше чотири сценарії.</w:t>
       </w:r>
     </w:p>
     <w:p>
@@ -3714,7 +3813,7 @@
           <w:sz w:val="21"/>
           <w:rFonts w:ascii="Calibri" w:hAnsi="Calibri"/>
         </w:rPr>
-        <w:t xml:space="preserve">Автоматизована перевірка — dotnet test tests/SecureLab.Api.Tests (Release):</w:t>
+        <w:t xml:space="preserve">Автоматизована перевірка — dotnet test tests/SecureLab.Api.Tests:</w:t>
       </w:r>
     </w:p>
     <w:p>
@@ -3735,7 +3834,7 @@
                     <pic:cNvPicPr/>
                   </pic:nvPicPr>
                   <pic:blipFill>
-                    <a:blip xmlns:r="http://schemas.openxmlformats.org/officeDocument/2006/relationships" r:embed="R09a5889036274a91"/>
+                    <a:blip xmlns:r="http://schemas.openxmlformats.org/officeDocument/2006/relationships" r:embed="R3bc89ea5741e4fb7"/>
                     <a:stretch>
                       <a:fillRect/>
                     </a:stretch>
@@ -3781,98 +3880,98 @@
           <w:sz w:val="21"/>
           <w:rFonts w:ascii="Calibri" w:hAnsi="Calibri"/>
         </w:rPr>
-        <w:t xml:space="preserve">•  GetIncidents_ReturnsSeededIncidents</w:t>
-      </w:r>
-    </w:p>
-    <w:p>
-      <w:pPr>
-        <w:ind w:left="360" w:hanging="220"/>
-        <w:spacing w:after="30"/>
-      </w:pPr>
-      <w:r>
-        <w:rPr>
-          <w:sz w:val="21"/>
-          <w:rFonts w:ascii="Calibri" w:hAnsi="Calibri"/>
-        </w:rPr>
-        <w:t xml:space="preserve">•  GetIncidentDetails_UnknownId_ReturnsProblemDetails404</w:t>
-      </w:r>
-    </w:p>
-    <w:p>
-      <w:pPr>
-        <w:ind w:left="360" w:hanging="220"/>
-        <w:spacing w:after="30"/>
-      </w:pPr>
-      <w:r>
-        <w:rPr>
-          <w:sz w:val="21"/>
-          <w:rFonts w:ascii="Calibri" w:hAnsi="Calibri"/>
-        </w:rPr>
-        <w:t xml:space="preserve">•  GetIncidentDetails_DoesNotExposeOwnerUserIdOrEmail</w:t>
-      </w:r>
-    </w:p>
-    <w:p>
-      <w:pPr>
-        <w:ind w:left="360" w:hanging="220"/>
-        <w:spacing w:after="30"/>
-      </w:pPr>
-      <w:r>
-        <w:rPr>
-          <w:sz w:val="21"/>
-          <w:rFonts w:ascii="Calibri" w:hAnsi="Calibri"/>
-        </w:rPr>
-        <w:t xml:space="preserve">•  ClientScript_DoesNotUseDangerousInnerHtmlSink (забороняє innerHTML / outerHTML / insertAdjacentHTML / document.write)</w:t>
-      </w:r>
-    </w:p>
-    <w:p>
-      <w:pPr>
-        <w:ind w:left="360" w:hanging="220"/>
-        <w:spacing w:after="30"/>
-      </w:pPr>
-      <w:r>
-        <w:rPr>
-          <w:sz w:val="21"/>
-          <w:rFonts w:ascii="Calibri" w:hAnsi="Calibri"/>
-        </w:rPr>
-        <w:t xml:space="preserve">•  GetSeveritySummary_ReturnsAllLevelsInCriticalityOrder_WithBaselineSeedCounts</w:t>
-      </w:r>
-    </w:p>
-    <w:p>
-      <w:pPr>
-        <w:ind w:left="360" w:hanging="220"/>
-        <w:spacing w:after="30"/>
-      </w:pPr>
-      <w:r>
-        <w:rPr>
-          <w:sz w:val="21"/>
-          <w:rFonts w:ascii="Calibri" w:hAnsi="Calibri"/>
-        </w:rPr>
-        <w:t xml:space="preserve">•  GetSeveritySummary_WithStatusFilter_CountsOnlyMatchingIncidents</w:t>
-      </w:r>
-    </w:p>
-    <w:p>
-      <w:pPr>
-        <w:ind w:left="360" w:hanging="220"/>
-        <w:spacing w:after="30"/>
-      </w:pPr>
-      <w:r>
-        <w:rPr>
-          <w:sz w:val="21"/>
-          <w:rFonts w:ascii="Calibri" w:hAnsi="Calibri"/>
-        </w:rPr>
-        <w:t xml:space="preserve">•  GetSeveritySummary_UnknownStatus_ReturnsValidationProblem400</w:t>
-      </w:r>
-    </w:p>
-    <w:p>
-      <w:pPr>
-        <w:ind w:left="360" w:hanging="220"/>
-        <w:spacing w:after="30"/>
-      </w:pPr>
-      <w:r>
-        <w:rPr>
-          <w:sz w:val="21"/>
-          <w:rFonts w:ascii="Calibri" w:hAnsi="Calibri"/>
-        </w:rPr>
-        <w:t xml:space="preserve">•  GetSeveritySummary_IsNoLongerBaseline501</w:t>
+        <w:t xml:space="preserve">•  GetIncidents_ReturnsSeededIncidents — список повертає seed-інциденти.</w:t>
+      </w:r>
+    </w:p>
+    <w:p>
+      <w:pPr>
+        <w:ind w:left="360" w:hanging="220"/>
+        <w:spacing w:after="30"/>
+      </w:pPr>
+      <w:r>
+        <w:rPr>
+          <w:sz w:val="21"/>
+          <w:rFonts w:ascii="Calibri" w:hAnsi="Calibri"/>
+        </w:rPr>
+        <w:t xml:space="preserve">•  GetIncidentDetails_UnknownId_ReturnsProblemDetails404 — невідомий id дає 404 Problem Details.</w:t>
+      </w:r>
+    </w:p>
+    <w:p>
+      <w:pPr>
+        <w:ind w:left="360" w:hanging="220"/>
+        <w:spacing w:after="30"/>
+      </w:pPr>
+      <w:r>
+        <w:rPr>
+          <w:sz w:val="21"/>
+          <w:rFonts w:ascii="Calibri" w:hAnsi="Calibri"/>
+        </w:rPr>
+        <w:t xml:space="preserve">•  GetIncidentDetails_DoesNotExposeOwnerUserIdOrEmail — у деталях немає ownerUserId та email.</w:t>
+      </w:r>
+    </w:p>
+    <w:p>
+      <w:pPr>
+        <w:ind w:left="360" w:hanging="220"/>
+        <w:spacing w:after="30"/>
+      </w:pPr>
+      <w:r>
+        <w:rPr>
+          <w:sz w:val="21"/>
+          <w:rFonts w:ascii="Calibri" w:hAnsi="Calibri"/>
+        </w:rPr>
+        <w:t xml:space="preserve">•  ClientScript_DoesNotUseDangerousInnerHtmlSink — app.js не використовує небезпечні способи вставки в DOM.</w:t>
+      </w:r>
+    </w:p>
+    <w:p>
+      <w:pPr>
+        <w:ind w:left="360" w:hanging="220"/>
+        <w:spacing w:after="30"/>
+      </w:pPr>
+      <w:r>
+        <w:rPr>
+          <w:sz w:val="21"/>
+          <w:rFonts w:ascii="Calibri" w:hAnsi="Calibri"/>
+        </w:rPr>
+        <w:t xml:space="preserve">•  GetSeveritySummary_ReturnsAllLevelsInCriticalityOrder_WithBaselineSeedCounts — усі 4 рівні, порядок, лічильники.</w:t>
+      </w:r>
+    </w:p>
+    <w:p>
+      <w:pPr>
+        <w:ind w:left="360" w:hanging="220"/>
+        <w:spacing w:after="30"/>
+      </w:pPr>
+      <w:r>
+        <w:rPr>
+          <w:sz w:val="21"/>
+          <w:rFonts w:ascii="Calibri" w:hAnsi="Calibri"/>
+        </w:rPr>
+        <w:t xml:space="preserve">•  GetSeveritySummary_WithStatusFilter_CountsOnlyMatchingIncidents — фільтр ?status= рахує лише потрібні.</w:t>
+      </w:r>
+    </w:p>
+    <w:p>
+      <w:pPr>
+        <w:ind w:left="360" w:hanging="220"/>
+        <w:spacing w:after="30"/>
+      </w:pPr>
+      <w:r>
+        <w:rPr>
+          <w:sz w:val="21"/>
+          <w:rFonts w:ascii="Calibri" w:hAnsi="Calibri"/>
+        </w:rPr>
+        <w:t xml:space="preserve">•  GetSeveritySummary_UnknownStatus_ReturnsValidationProblem400 — невідомий ?status= дає 400.</w:t>
+      </w:r>
+    </w:p>
+    <w:p>
+      <w:pPr>
+        <w:ind w:left="360" w:hanging="220"/>
+        <w:spacing w:after="30"/>
+      </w:pPr>
+      <w:r>
+        <w:rPr>
+          <w:sz w:val="21"/>
+          <w:rFonts w:ascii="Calibri" w:hAnsi="Calibri"/>
+        </w:rPr>
+        <w:t xml:space="preserve">•  GetSeveritySummary_IsNoLongerBaseline501 — endpoint більше не повертає 501.</w:t>
       </w:r>
     </w:p>
     <w:p>
@@ -3886,137 +3985,137 @@
           <w:rFonts w:ascii="Calibri" w:hAnsi="Calibri"/>
           <w:color w:val="2E4A6B"/>
         </w:rPr>
-        <w:t>Контрольна точка CP-03 — реалізоване наскрізне розширення</w:t>
-      </w:r>
-    </w:p>
-    <w:p>
-      <w:pPr>
-        <w:ind w:left="360" w:hanging="220"/>
-        <w:spacing w:after="30"/>
-      </w:pPr>
-      <w:r>
-        <w:rPr>
-          <w:sz w:val="21"/>
-          <w:rFonts w:ascii="Calibri" w:hAnsi="Calibri"/>
-        </w:rPr>
-        <w:t xml:space="preserve">•  severity-summary до зміни — 501, після реалізації — 200.</w:t>
-      </w:r>
-    </w:p>
-    <w:p>
-      <w:pPr>
-        <w:ind w:left="360" w:hanging="220"/>
-        <w:spacing w:after="30"/>
-      </w:pPr>
-      <w:r>
-        <w:rPr>
-          <w:sz w:val="21"/>
-          <w:rFonts w:ascii="Calibri" w:hAnsi="Calibri"/>
-        </w:rPr>
-        <w:t xml:space="preserve">•  Окремий response DTO IncidentSeveritySummaryResponse без зайвих полів entity.</w:t>
-      </w:r>
-    </w:p>
-    <w:p>
-      <w:pPr>
-        <w:ind w:left="360" w:hanging="220"/>
-        <w:spacing w:after="30"/>
-      </w:pPr>
-      <w:r>
-        <w:rPr>
-          <w:sz w:val="21"/>
-          <w:rFonts w:ascii="Calibri" w:hAnsi="Calibri"/>
-        </w:rPr>
-        <w:t xml:space="preserve">•  Асинхронний query через AsNoTracking(), GroupBy, Count(), ToListAsync(cancellationToken).</w:t>
-      </w:r>
-    </w:p>
-    <w:p>
-      <w:pPr>
-        <w:ind w:left="360" w:hanging="220"/>
-        <w:spacing w:after="30"/>
-      </w:pPr>
-      <w:r>
-        <w:rPr>
-          <w:sz w:val="21"/>
-          <w:rFonts w:ascii="Calibri" w:hAnsi="Calibri"/>
-        </w:rPr>
-        <w:t xml:space="preserve">•  За baseline seed — Low/Medium/High по одному, Critical з count: 0 (політика повного переліку).</w:t>
-      </w:r>
-    </w:p>
-    <w:p>
-      <w:pPr>
-        <w:ind w:left="360" w:hanging="220"/>
-        <w:spacing w:after="30"/>
-      </w:pPr>
-      <w:r>
-        <w:rPr>
-          <w:sz w:val="21"/>
-          <w:rFonts w:ascii="Calibri" w:hAnsi="Calibri"/>
-        </w:rPr>
-        <w:t xml:space="preserve">•  Задокументована політика нульових груп і сталий порядок критичності.</w:t>
-      </w:r>
-    </w:p>
-    <w:p>
-      <w:pPr>
-        <w:ind w:left="360" w:hanging="220"/>
-        <w:spacing w:after="30"/>
-      </w:pPr>
-      <w:r>
-        <w:rPr>
-          <w:sz w:val="21"/>
-          <w:rFonts w:ascii="Calibri" w:hAnsi="Calibri"/>
-        </w:rPr>
-        <w:t xml:space="preserve">•  Endpoint із DI та metadata успішної відповіді замість baseline 501.</w:t>
-      </w:r>
-    </w:p>
-    <w:p>
-      <w:pPr>
-        <w:ind w:left="360" w:hanging="220"/>
-        <w:spacing w:after="30"/>
-      </w:pPr>
-      <w:r>
-        <w:rPr>
-          <w:sz w:val="21"/>
-          <w:rFonts w:ascii="Calibri" w:hAnsi="Calibri"/>
-        </w:rPr>
-        <w:t xml:space="preserve">•  Network-запит із клієнта, безпечний показ результату; стани завантаження / порожньо / безпечна помилка.</w:t>
-      </w:r>
-    </w:p>
-    <w:p>
-      <w:pPr>
-        <w:ind w:left="360" w:hanging="220"/>
-        <w:spacing w:after="30"/>
-      </w:pPr>
-      <w:r>
-        <w:rPr>
-          <w:sz w:val="21"/>
-          <w:rFonts w:ascii="Calibri" w:hAnsi="Calibri"/>
-        </w:rPr>
-        <w:t xml:space="preserve">•  DOM-вивід через textContent.</w:t>
-      </w:r>
-    </w:p>
-    <w:p>
-      <w:pPr>
-        <w:ind w:left="360" w:hanging="220"/>
-        <w:spacing w:after="30"/>
-      </w:pPr>
-      <w:r>
-        <w:rPr>
-          <w:sz w:val="21"/>
-          <w:rFonts w:ascii="Calibri" w:hAnsi="Calibri"/>
-        </w:rPr>
-        <w:t xml:space="preserve">•  Структурований log без чутливих даних.</w:t>
-      </w:r>
-    </w:p>
-    <w:p>
-      <w:pPr>
-        <w:ind w:left="360" w:hanging="220"/>
-        <w:spacing w:after="30"/>
-      </w:pPr>
-      <w:r>
-        <w:rPr>
-          <w:sz w:val="21"/>
-          <w:rFonts w:ascii="Calibri" w:hAnsi="Calibri"/>
-        </w:rPr>
-        <w:t xml:space="preserve">•  Відтворювані сценарії .http + 4 інтеграційні тести; підсумок автоматизованої перевірки — 8/8.</w:t>
+        <w:t>Контрольна точка CP-03 — реалізоване розширення</w:t>
+      </w:r>
+    </w:p>
+    <w:p>
+      <w:pPr>
+        <w:ind w:left="360" w:hanging="220"/>
+        <w:spacing w:after="30"/>
+      </w:pPr>
+      <w:r>
+        <w:rPr>
+          <w:sz w:val="21"/>
+          <w:rFonts w:ascii="Calibri" w:hAnsi="Calibri"/>
+        </w:rPr>
+        <w:t xml:space="preserve">•  severity-summary: було 501 — стало 200.</w:t>
+      </w:r>
+    </w:p>
+    <w:p>
+      <w:pPr>
+        <w:ind w:left="360" w:hanging="220"/>
+        <w:spacing w:after="30"/>
+      </w:pPr>
+      <w:r>
+        <w:rPr>
+          <w:sz w:val="21"/>
+          <w:rFonts w:ascii="Calibri" w:hAnsi="Calibri"/>
+        </w:rPr>
+        <w:t xml:space="preserve">•  Окремий response DTO без зайвих полів entity.</w:t>
+      </w:r>
+    </w:p>
+    <w:p>
+      <w:pPr>
+        <w:ind w:left="360" w:hanging="220"/>
+        <w:spacing w:after="30"/>
+      </w:pPr>
+      <w:r>
+        <w:rPr>
+          <w:sz w:val="21"/>
+          <w:rFonts w:ascii="Calibri" w:hAnsi="Calibri"/>
+        </w:rPr>
+        <w:t xml:space="preserve">•  Асинхронний запит через AsNoTracking(), GroupBy, Count(), ToListAsync(cancellationToken).</w:t>
+      </w:r>
+    </w:p>
+    <w:p>
+      <w:pPr>
+        <w:ind w:left="360" w:hanging="220"/>
+        <w:spacing w:after="30"/>
+      </w:pPr>
+      <w:r>
+        <w:rPr>
+          <w:sz w:val="21"/>
+          <w:rFonts w:ascii="Calibri" w:hAnsi="Calibri"/>
+        </w:rPr>
+        <w:t xml:space="preserve">•  За baseline seed — Low/Medium/High по одному, Critical з count: 0.</w:t>
+      </w:r>
+    </w:p>
+    <w:p>
+      <w:pPr>
+        <w:ind w:left="360" w:hanging="220"/>
+        <w:spacing w:after="30"/>
+      </w:pPr>
+      <w:r>
+        <w:rPr>
+          <w:sz w:val="21"/>
+          <w:rFonts w:ascii="Calibri" w:hAnsi="Calibri"/>
+        </w:rPr>
+        <w:t xml:space="preserve">•  Політика нульових груп і сталий порядок задокументовані (у коментарі DTO і в architecture.md).</w:t>
+      </w:r>
+    </w:p>
+    <w:p>
+      <w:pPr>
+        <w:ind w:left="360" w:hanging="220"/>
+        <w:spacing w:after="30"/>
+      </w:pPr>
+      <w:r>
+        <w:rPr>
+          <w:sz w:val="21"/>
+          <w:rFonts w:ascii="Calibri" w:hAnsi="Calibri"/>
+        </w:rPr>
+        <w:t xml:space="preserve">•  Endpoint із DI та metadata успішної відповіді замість 501.</w:t>
+      </w:r>
+    </w:p>
+    <w:p>
+      <w:pPr>
+        <w:ind w:left="360" w:hanging="220"/>
+        <w:spacing w:after="30"/>
+      </w:pPr>
+      <w:r>
+        <w:rPr>
+          <w:sz w:val="21"/>
+          <w:rFonts w:ascii="Calibri" w:hAnsi="Calibri"/>
+        </w:rPr>
+        <w:t xml:space="preserve">•  Виклик із клієнта, безпечний показ; стани завантаження / порожньо / помилка.</w:t>
+      </w:r>
+    </w:p>
+    <w:p>
+      <w:pPr>
+        <w:ind w:left="360" w:hanging="220"/>
+        <w:spacing w:after="30"/>
+      </w:pPr>
+      <w:r>
+        <w:rPr>
+          <w:sz w:val="21"/>
+          <w:rFonts w:ascii="Calibri" w:hAnsi="Calibri"/>
+        </w:rPr>
+        <w:t xml:space="preserve">•  Вивід у DOM через textContent.</w:t>
+      </w:r>
+    </w:p>
+    <w:p>
+      <w:pPr>
+        <w:ind w:left="360" w:hanging="220"/>
+        <w:spacing w:after="30"/>
+      </w:pPr>
+      <w:r>
+        <w:rPr>
+          <w:sz w:val="21"/>
+          <w:rFonts w:ascii="Calibri" w:hAnsi="Calibri"/>
+        </w:rPr>
+        <w:t xml:space="preserve">•  Структурований лог без чутливих даних.</w:t>
+      </w:r>
+    </w:p>
+    <w:p>
+      <w:pPr>
+        <w:ind w:left="360" w:hanging="220"/>
+        <w:spacing w:after="30"/>
+      </w:pPr>
+      <w:r>
+        <w:rPr>
+          <w:sz w:val="21"/>
+          <w:rFonts w:ascii="Calibri" w:hAnsi="Calibri"/>
+        </w:rPr>
+        <w:t xml:space="preserve">•  .http-сценарій + 4 інтеграційні тести; підсумок автоматизованої перевірки — 8/8.</w:t>
       </w:r>
     </w:p>
     <w:p>
@@ -4046,7 +4145,7 @@
           <w:sz w:val="21"/>
           <w:rFonts w:ascii="Calibri" w:hAnsi="Calibri"/>
         </w:rPr>
-        <w:t xml:space="preserve">•  DEL-01 — репозиторій і тег: гілки lab/1-system і main, тег v0.1.0 на злитому перевіреному commit a2898d7 (git rev-parse HEAD == git rev-list -n 1 v0.1.0).</w:t>
+        <w:t xml:space="preserve">•  DEL-01 — репозиторій і тег: гілки lab/1-system і main; фінальний тег v0.1.0 на злитому перевіреному commit a2898d7 (git rev-parse HEAD == git rev-list -n 1 v0.1.0).</w:t>
       </w:r>
     </w:p>
     <w:p>
@@ -4072,20 +4171,20 @@
           <w:sz w:val="21"/>
           <w:rFonts w:ascii="Calibri" w:hAnsi="Calibri"/>
         </w:rPr>
-        <w:t xml:space="preserve">•  DEL-03 — цей звіт: назва варіанта, гілки, тег і commit hash; стан навчального PostgreSQL; опис зміненого маршруту; HTTP-відповідь 501 до реалізації; request/response успішного сценарію та 404; запис Network; фрагмент endpoint → application layer → DbContext; результат нової функції; карта потоку; фактичний результат автоматизованої перевірки (8/8).</w:t>
-      </w:r>
-    </w:p>
-    <w:p>
-      <w:pPr>
-        <w:ind w:left="360" w:hanging="220"/>
-        <w:spacing w:after="30"/>
-      </w:pPr>
-      <w:r>
-        <w:rPr>
-          <w:sz w:val="21"/>
-          <w:rFonts w:ascii="Calibri" w:hAnsi="Calibri"/>
-        </w:rPr>
-        <w:t xml:space="preserve">•  Перегляд diff на секрети: .gitignore виключає infra/.env, *.env (крім infra/.env.example), *.dump, *.log, bin/obj, .vs/. У staged diff та історії немає .env з реальними значеннями, паролів поза відкритим навчальним, cookies, токенів, дампів БД чи журналів із credentials.</w:t>
+        <w:t xml:space="preserve">•  DEL-03 — цей звіт.</w:t>
+      </w:r>
+    </w:p>
+    <w:p>
+      <w:pPr>
+        <w:ind w:left="360" w:hanging="220"/>
+        <w:spacing w:after="30"/>
+      </w:pPr>
+      <w:r>
+        <w:rPr>
+          <w:sz w:val="21"/>
+          <w:rFonts w:ascii="Calibri" w:hAnsi="Calibri"/>
+        </w:rPr>
+        <w:t xml:space="preserve">•  Перегляд diff на секрети: .gitignore виключає infra/.env, *.env (крім прикладу), *.dump, *.log, bin/obj, .vs/. У diff та історії немає .env з реальними значеннями, паролів поза відкритим навчальним, cookies, токенів, дампів БД чи журналів із credentials.</w:t>
       </w:r>
     </w:p>
   </w:body>

</xml_diff>